<commit_message>
Update n2d workflows and episode assets
</commit_message>
<xml_diff>
--- a/创作区/写小说/仙界闭关小能手-王敦外传/导出/王敦传：开局九龙气运，我在灵药谷装管事.docx
+++ b/创作区/写小说/仙界闭关小能手-王敦外传/导出/王敦传：开局九龙气运，我在灵药谷装管事.docx
@@ -14,12 +14,12 @@
     </w:p>
     <w:p>
       <w:r>
-        <w:t>模式：parallel    规模：long    章数：20    字数：95223</w:t>
-      </w:r>
-    </w:p>
-    <w:p>
-      <w:r>
-        <w:t>版权状态：user-declared    权利辖区：user-declared    生成日期：2026-07-01</w:t>
+        <w:t>模式：parallel    规模：long    章数：20    字数：110235</w:t>
+      </w:r>
+    </w:p>
+    <w:p>
+      <w:r>
+        <w:t>版权状态：user-declared    权利辖区：user-declared    生成日期：2026-07-03</w:t>
       </w:r>
     </w:p>
     <w:p>
@@ -108,6 +108,171 @@
     </w:p>
     <w:p>
       <w:r>
+        <w:t>可缝是缝，钻过去的疼，还得他自己受。</w:t>
+      </w:r>
+    </w:p>
+    <w:p>
+      <w:r>
+        <w:t>王敦肩胛骨抵着阵纹边缘，皮肉被玄铁墙上的倒刺刮开一线，温热的血刚冒出来，就被地底寒气冻成薄痂。他不敢用灵力护体。第七层的封锁阵最阴毒，专吃修士外放的真元，哪怕泄出一丝，都能让阵眼里的铜铃响到皇城上头去。</w:t>
+      </w:r>
+    </w:p>
+    <w:p>
+      <w:r>
+        <w:t>于是他只能靠肉身硬挤。</w:t>
+      </w:r>
+    </w:p>
+    <w:p>
+      <w:r>
+        <w:t>宽肩，一寸一寸往里收；脊骨，一节一节往下折；连呼吸都得按着锁链换气的节拍走。慢半拍，后头巡夜狱卒能听见；快半拍，金链回流会把他整个人拖回阵心。</w:t>
+      </w:r>
+    </w:p>
+    <w:p>
+      <w:r>
+        <w:t>这一道缝，他不是撞大运撞出来的。</w:t>
+      </w:r>
+    </w:p>
+    <w:p>
+      <w:r>
+        <w:t>三年里，天牢第七层的每一道脚步声、每一次灯笼换油、每个狱卒酒后偷懒的时辰，他都记得清清楚楚。左边那位狱卒爱在丑时打瞌睡，右边那位每逢初七会去赌坊欠债，坐镇阵眼的结丹头目有旧伤，遇阴雨天神识会漏掉三丈。他把这些破绽一粒一粒攒起来，像穷人攒铜板，攒到今夜，才敢拿命去买这半个呼吸。</w:t>
+      </w:r>
+    </w:p>
+    <w:p>
+      <w:r>
+        <w:t>所以他最烦旁人说他命好。</w:t>
+      </w:r>
+    </w:p>
+    <w:p>
+      <w:r>
+        <w:t>命好？</w:t>
+      </w:r>
+    </w:p>
+    <w:p>
+      <w:r>
+        <w:t>命好的人，用不着把自己缩成一条狗，从排灵废沟里往外爬。</w:t>
+      </w:r>
+    </w:p>
+    <w:p>
+      <w:r>
+        <w:t>他牙关咬得咯吱作响，黑脸贴着满是污水的沟壁往前挪。废沟里混着炼丹残渣、腐坏灵兽血和天牢里积了百年的阴湿味，熏得人眼前发黑。王敦却连眉头都没皱一下。</w:t>
+      </w:r>
+    </w:p>
+    <w:p>
+      <w:r>
+        <w:t>他在心里数。</w:t>
+      </w:r>
+    </w:p>
+    <w:p>
+      <w:r>
+        <w:t>一息。</w:t>
+      </w:r>
+    </w:p>
+    <w:p>
+      <w:r>
+        <w:t>两息。</w:t>
+      </w:r>
+    </w:p>
+    <w:p>
+      <w:r>
+        <w:t>三息。</w:t>
+      </w:r>
+    </w:p>
+    <w:p>
+      <w:r>
+        <w:t>第九息时，头顶那道金链回流的嗡鸣果然迟了半拍。</w:t>
+      </w:r>
+    </w:p>
+    <w:p>
+      <w:r>
+        <w:t>王敦咧嘴。</w:t>
+      </w:r>
+    </w:p>
+    <w:p>
+      <w:r>
+        <w:t>“老天爷给缝。”他在臭水里无声地笑，“老子自己爬。”</w:t>
+      </w:r>
+    </w:p>
+    <w:p>
+      <w:r>
+        <w:t>他爬到废沟尽头时，外头已经响起第一声铜钟。</w:t>
+      </w:r>
+    </w:p>
+    <w:p>
+      <w:r>
+        <w:t>不是巡夜钟。</w:t>
+      </w:r>
+    </w:p>
+    <w:p>
+      <w:r>
+        <w:t>是天牢最深处的锁运钟。</w:t>
+      </w:r>
+    </w:p>
+    <w:p>
+      <w:r>
+        <w:t>那钟一响，整座皇城的阵师都会被惊醒，齐国皇监外头那条黑水河也会立刻封死。王敦只剩不到半盏茶的工夫。半盏茶后，河底的排灵口会反锁，所有废沟里的东西，不管是污水、残渣，还是他这个不该活着的九龙逃犯，都会被阵火烧成灰。</w:t>
+      </w:r>
+    </w:p>
+    <w:p>
+      <w:r>
+        <w:t>他抬头看了看前方。</w:t>
+      </w:r>
+    </w:p>
+    <w:p>
+      <w:r>
+        <w:t>废沟尽头有三道铁栅。</w:t>
+      </w:r>
+    </w:p>
+    <w:p>
+      <w:r>
+        <w:t>第一道锈了，能掰。</w:t>
+      </w:r>
+    </w:p>
+    <w:p>
+      <w:r>
+        <w:t>第二道刻着符，不能碰，一碰就响。</w:t>
+      </w:r>
+    </w:p>
+    <w:p>
+      <w:r>
+        <w:t>第三道外头，是黑水河。</w:t>
+      </w:r>
+    </w:p>
+    <w:p>
+      <w:r>
+        <w:t>这些他也等了三年。每逢月末，皇监会把炼废的丹渣顺着这条沟排出去，丹渣腐蚀栅栏，第一道最薄；第二道符栅换气时有一线盲点；第三道最凶，却也离河最近。</w:t>
+      </w:r>
+    </w:p>
+    <w:p>
+      <w:r>
+        <w:t>王敦咬住破符残角，把两只手伸进污水里，摸到那道早被丹渣蚀松的铁栅，慢慢发力。</w:t>
+      </w:r>
+    </w:p>
+    <w:p>
+      <w:r>
+        <w:t>铁条无声弯开。</w:t>
+      </w:r>
+    </w:p>
+    <w:p>
+      <w:r>
+        <w:t>他的指甲也跟着翻了两片。</w:t>
+      </w:r>
+    </w:p>
+    <w:p>
+      <w:r>
+        <w:t>疼得他眼前一黑。</w:t>
+      </w:r>
+    </w:p>
+    <w:p>
+      <w:r>
+        <w:t>他却连哼都没哼。</w:t>
+      </w:r>
+    </w:p>
+    <w:p>
+      <w:r>
+        <w:t>从今夜起，这条命若还能活下去，便再不是齐国皇室笼子里的东西。</w:t>
+      </w:r>
+    </w:p>
+    <w:p>
+      <w:r>
         <w:t>地底九千丈，九层封锁阵，三百六十名狱卒，外加一尊坐镇的化神期老祖——这是大齐皇室为他这么一个小小炼气期修士准备的牢笼。</w:t>
       </w:r>
     </w:p>
@@ -736,6 +901,391 @@
     </w:p>
     <w:p>
       <w:r>
+        <w:t>不过要定，不等于要把人榨干。</w:t>
+      </w:r>
+    </w:p>
+    <w:p>
+      <w:r>
+        <w:t>王敦这点良心不多，但也没黑到枯木那老东西那份上。他招贺平生进谷，是想借这口纯火淬体、养花、藏锋芒。可真看见少年那双草鞋开了口、袖口磨得发亮、手指上还有旧伤茧子时，他心里那点算盘，忽然轻轻顿了一下。</w:t>
+      </w:r>
+    </w:p>
+    <w:p>
+      <w:r>
+        <w:t>穷人家的孩子，王敦见得多。</w:t>
+      </w:r>
+    </w:p>
+    <w:p>
+      <w:r>
+        <w:t>这种人最好用，也最不好用。好用在给他一条活路，他就肯把自己当牲口使；不好用在他真把你当恩人时，那份信，比灵石重，也比毒药麻烦。</w:t>
+      </w:r>
+    </w:p>
+    <w:p>
+      <w:r>
+        <w:t>王敦最怕这个。</w:t>
+      </w:r>
+    </w:p>
+    <w:p>
+      <w:r>
+        <w:t>信任这东西，会让人回头。</w:t>
+      </w:r>
+    </w:p>
+    <w:p>
+      <w:r>
+        <w:t>而他这辈子，能活到今天，全靠从不回头。</w:t>
+      </w:r>
+    </w:p>
+    <w:p>
+      <w:r>
+        <w:t>他盯着贺平生掌心那簇火，看了好一会儿。火光映在少年眼底，不飘，不躲，干净得有点扎眼。王敦忽然想起很多年前，自己第一次被押进齐国皇监时，也曾经这么直挺挺地站着。后来一层一层刑阵压下来，人就学会弯了，学会笑了，学会把真话揉碎了藏在脏话和玩笑里。</w:t>
+      </w:r>
+    </w:p>
+    <w:p>
+      <w:r>
+        <w:t>眼前这小子，还没学会。</w:t>
+      </w:r>
+    </w:p>
+    <w:p>
+      <w:r>
+        <w:t>也许以后会学。</w:t>
+      </w:r>
+    </w:p>
+    <w:p>
+      <w:r>
+        <w:t>但至少今天，王敦不想亲手把他往那条路上推得太快。</w:t>
+      </w:r>
+    </w:p>
+    <w:p>
+      <w:r>
+        <w:t>“火是好火。”他心里把这句话咽了下去，脸上却故意嫌弃，“人嘛，得再看看。”</w:t>
+      </w:r>
+    </w:p>
+    <w:p>
+      <w:r>
+        <w:t>他已经打定主意。</w:t>
+      </w:r>
+    </w:p>
+    <w:p>
+      <w:r>
+        <w:t>规矩要教，账要算，苦活也少不了。灵药谷不是善堂，他王敦更不是善人。可有些底线，他得替这小子先划住：枯木盘剥归枯木盘剥，他这个管事盘剥归盘剥，真到了要命的时候，不能让一个供火的穷小子先去填坑。</w:t>
+      </w:r>
+    </w:p>
+    <w:p>
+      <w:r>
+        <w:t>这念头刚冒出来，王敦自己先乐了。</w:t>
+      </w:r>
+    </w:p>
+    <w:p>
+      <w:r>
+        <w:t>“娘的。”他在心里骂自己，“收个火工，还收出慈悲心来了？”</w:t>
+      </w:r>
+    </w:p>
+    <w:p>
+      <w:r>
+        <w:t>骂归骂，那点念头到底没被他掐干净。</w:t>
+      </w:r>
+    </w:p>
+    <w:p>
+      <w:r>
+        <w:t>他甚至已经盘算好了：先让贺平生跟着他住在谷里最靠近火塘的小偏屋，那地方破归破，夜里暖；供火时每两个时辰换一次息，别学那些老杂役一烧就是整夜；每旬分一点边角料灵药渣，让这小子熬体，不至于把根基烧空。</w:t>
+      </w:r>
+    </w:p>
+    <w:p>
+      <w:r>
+        <w:t>这些安排不能说。</w:t>
+      </w:r>
+    </w:p>
+    <w:p>
+      <w:r>
+        <w:t>说出来，就不像压榨了。</w:t>
+      </w:r>
+    </w:p>
+    <w:p>
+      <w:r>
+        <w:t>不像压榨，旁人就会起疑；贺平生也会起疑。</w:t>
+      </w:r>
+    </w:p>
+    <w:p>
+      <w:r>
+        <w:t>王敦最擅长把好事办得像坏事，把护人说成占便宜。这样别人骂他抠门，他心里踏实；别人真念他好，他反而不知道该往哪儿躲。</w:t>
+      </w:r>
+    </w:p>
+    <w:p>
+      <w:r>
+        <w:t>他甚至已经想好了今晚怎么安顿。</w:t>
+      </w:r>
+    </w:p>
+    <w:p>
+      <w:r>
+        <w:t>偏屋不能说是给贺平生住的，得说“火工离火塘近，夜里叫得动”；边角料灵药渣不能说是补身子，得说“废物利用，别浪费谷里东西”；供火间隙的休息不能说是怕这小子熬坏根骨，得说“你倒下了谁给老子烧火”。</w:t>
+      </w:r>
+    </w:p>
+    <w:p>
+      <w:r>
+        <w:t>话要难听。</w:t>
+      </w:r>
+    </w:p>
+    <w:p>
+      <w:r>
+        <w:t>事要做实。</w:t>
+      </w:r>
+    </w:p>
+    <w:p>
+      <w:r>
+        <w:t>这是王敦在逃亡里学来的保命法子。好意露得太明，容易招人惦记；恶名挂得稳，反倒没人细查。他要把贺平生藏在“被管事压榨的穷火工”这个身份里，藏得越苦越不起眼越好。</w:t>
+      </w:r>
+    </w:p>
+    <w:p>
+      <w:r>
+        <w:t>枯木真人那双眼睛太冷。</w:t>
+      </w:r>
+    </w:p>
+    <w:p>
+      <w:r>
+        <w:t>王敦今天带人过去过目，看似只是报个新火工，实则是在试那老东西的反应。若枯木对这纯火灵根起了贪念，他就得换一套藏法；若枯木只当这是个能用的杂役，那最好不过。</w:t>
+      </w:r>
+    </w:p>
+    <w:p>
+      <w:r>
+        <w:t>灵药谷小是小，里头也有吃人的规矩。</w:t>
+      </w:r>
+    </w:p>
+    <w:p>
+      <w:r>
+        <w:t>王敦自己能在规矩缝里钻来钻去，却不敢保证一个刚进谷的穷少年也钻得明白。</w:t>
+      </w:r>
+    </w:p>
+    <w:p>
+      <w:r>
+        <w:t>所以他得先把最难看的那张脸，替这小子摆在前头。</w:t>
+      </w:r>
+    </w:p>
+    <w:p>
+      <w:r>
+        <w:t>他还得让贺平生怕他一点。</w:t>
+      </w:r>
+    </w:p>
+    <w:p>
+      <w:r>
+        <w:t>怕，比亲近安全。</w:t>
+      </w:r>
+    </w:p>
+    <w:p>
+      <w:r>
+        <w:t>亲近会让人多看，多问，多替他出头。怕则简单得多：管事凶，管事抠，管事不讲理，管事只认火候和账册。这样贺平生往后被人问起王敦，第一反应也会是皱眉，说那黑脸管事净会压榨人，而不是说他其实心软。</w:t>
+      </w:r>
+    </w:p>
+    <w:p>
+      <w:r>
+        <w:t>心软这两个字，在逃犯身上最要命。</w:t>
+      </w:r>
+    </w:p>
+    <w:p>
+      <w:r>
+        <w:t>王敦把这层伪装想得很细。贺平生住的偏屋，得安排在火塘旁边，却不能新铺被褥，只能从库房里翻旧的；每旬灵药渣要给，但得当着众人的面骂他“烧火烧得跟死人一样，拿去补补，别耽误老子差事”；若有人欺负他，不能直接护，得借着“火工归我管”的名头，把人骂走。</w:t>
+      </w:r>
+    </w:p>
+    <w:p>
+      <w:r>
+        <w:t>做管事，不能只会管账。</w:t>
+      </w:r>
+    </w:p>
+    <w:p>
+      <w:r>
+        <w:t>还得会把好意藏进坏脾气里。</w:t>
+      </w:r>
+    </w:p>
+    <w:p>
+      <w:r>
+        <w:t>王敦觉得自己这方面天赋极高。</w:t>
+      </w:r>
+    </w:p>
+    <w:p>
+      <w:r>
+        <w:t>毕竟他这辈子，好话没学会几句，难听话倒是一箩筐。</w:t>
+      </w:r>
+    </w:p>
+    <w:p>
+      <w:r>
+        <w:t>规矩也得提前编好。</w:t>
+      </w:r>
+    </w:p>
+    <w:p>
+      <w:r>
+        <w:t>第一条，供火时不许逞强。明面上的说法是“你烧坏了花，老子扣你饭钱”；真正的意思是火灵力透支会伤根基，尤其贺平生这种纯火灵根，越纯越容易被人当成炉柴榨。</w:t>
+      </w:r>
+    </w:p>
+    <w:p>
+      <w:r>
+        <w:t>第二条，不许私自靠近紫色禁区。明面上的说法是“那边的花贵，碰坏一株卖了你都赔不起”；真正的意思是紫区底下埋着枯木真人多年暗账，连王敦都没摸透，一个炼气四层的小子进去，死了都没人收尸。</w:t>
+      </w:r>
+    </w:p>
+    <w:p>
+      <w:r>
+        <w:t>第三条，账册必须学。明面上的说法是“老子懒，往后小账你记”；真正的意思是会记账的人，才知道上头怎么盘剥底下，也才知道什么时候该闭嘴、什么时候该留证。</w:t>
+      </w:r>
+    </w:p>
+    <w:p>
+      <w:r>
+        <w:t>第四条，挨骂时别顶嘴。明面上的说法是“管事训人，天经地义”；真正的意思是枯木真人最爱看底下弟子露锋芒，谁越倔，越容易被他拎出来磨。</w:t>
+      </w:r>
+    </w:p>
+    <w:p>
+      <w:r>
+        <w:t>王敦越想越觉得自己像个操碎心的老妈子。</w:t>
+      </w:r>
+    </w:p>
+    <w:p>
+      <w:r>
+        <w:t>这不对。</w:t>
+      </w:r>
+    </w:p>
+    <w:p>
+      <w:r>
+        <w:t>他王敦，齐国天牢都敢钻，怎么能为了一个刚见面的火工，连吃饭睡觉记账挨骂都替人盘到这份上？</w:t>
+      </w:r>
+    </w:p>
+    <w:p>
+      <w:r>
+        <w:t>可那簇火实在太好。</w:t>
+      </w:r>
+    </w:p>
+    <w:p>
+      <w:r>
+        <w:t>那双眼也实在太直。</w:t>
+      </w:r>
+    </w:p>
+    <w:p>
+      <w:r>
+        <w:t>好火要养，直眼睛也得护一护。否则在灵药谷这种地方，早晚不是被人拿去烧炉，就是被人掰弯。</w:t>
+      </w:r>
+    </w:p>
+    <w:p>
+      <w:r>
+        <w:t>“算了。”他在心里给自己找台阶，“老子不是护他，老子是护自己的火。”</w:t>
+      </w:r>
+    </w:p>
+    <w:p>
+      <w:r>
+        <w:t>这个理由很好。</w:t>
+      </w:r>
+    </w:p>
+    <w:p>
+      <w:r>
+        <w:t>足够抠门，足够自私，足够像王敦。</w:t>
+      </w:r>
+    </w:p>
+    <w:p>
+      <w:r>
+        <w:t>他甚至能想象几年后这小子若真活出点模样，旁人问起早年是谁教他的，贺平生多半会沉默半天，说一句“灵药谷有个管事，脾气很差”。这就够了。</w:t>
+      </w:r>
+    </w:p>
+    <w:p>
+      <w:r>
+        <w:t>脾气差，比恩人安全。</w:t>
+      </w:r>
+    </w:p>
+    <w:p>
+      <w:r>
+        <w:t>恩人会被记在心里，脾气差的人只会被记在账上。王敦宁可自己待在账上，也不愿早早进谁心里。进了心里，就容易在关键时候害人回头。</w:t>
+      </w:r>
+    </w:p>
+    <w:p>
+      <w:r>
+        <w:t>可他又忍不住想：若真有那么一天，贺平生还能记得灵药谷、记得这两口火塘、记得有个黑脸管事教他怎么在烂规矩里活下去，那也不算坏。</w:t>
+      </w:r>
+    </w:p>
+    <w:p>
+      <w:r>
+        <w:t>这念头太软。</w:t>
+      </w:r>
+    </w:p>
+    <w:p>
+      <w:r>
+        <w:t>王敦立刻把它按了回去。</w:t>
+      </w:r>
+    </w:p>
+    <w:p>
+      <w:r>
+        <w:t>软念头不能多想。</w:t>
+      </w:r>
+    </w:p>
+    <w:p>
+      <w:r>
+        <w:t>多想就会变成牵挂，牵挂会拖慢跑路的腿。王敦这些年见过太多因为多看一眼、多说一句、多信一个人而死的倒霉蛋。他不想当倒霉蛋，也不想让贺平生当。</w:t>
+      </w:r>
+    </w:p>
+    <w:p>
+      <w:r>
+        <w:t>所以从今天起，他要教这小子火候，也要教这小子别轻易信人。</w:t>
+      </w:r>
+    </w:p>
+    <w:p>
+      <w:r>
+        <w:t>至于最后这小子会不会连他也不信。</w:t>
+      </w:r>
+    </w:p>
+    <w:p>
+      <w:r>
+        <w:t>那也好。</w:t>
+      </w:r>
+    </w:p>
+    <w:p>
+      <w:r>
+        <w:t>不信，反倒活得久。</w:t>
+      </w:r>
+    </w:p>
+    <w:p>
+      <w:r>
+        <w:t>但王敦心里又明白，贺平生大概学不会彻底不信。</w:t>
+      </w:r>
+    </w:p>
+    <w:p>
+      <w:r>
+        <w:t>这小子眼底那点火太干净，干净得不像会把人全往坏处想。也正因为这样，他才更得把规矩教狠一点。好人若不会防人，活不长；好人若学会防人，又还能留住一点好，才是真难得。</w:t>
+      </w:r>
+    </w:p>
+    <w:p>
+      <w:r>
+        <w:t>这活儿，比养烈阳花麻烦多了。</w:t>
+      </w:r>
+    </w:p>
+    <w:p>
+      <w:r>
+        <w:t>偏偏他已经接手，想退也晚了。</w:t>
+      </w:r>
+    </w:p>
+    <w:p>
+      <w:r>
+        <w:t>王敦向来不爱认命，可这会儿也只能捏着鼻子认下：这费钱货，他收定了，往后亏不亏，都算他自己眼光。</w:t>
+      </w:r>
+    </w:p>
+    <w:p>
+      <w:r>
+        <w:t>眼光差了，他也认。</w:t>
+      </w:r>
+    </w:p>
+    <w:p>
+      <w:r>
+        <w:t>反正他王敦这辈子，赌输过很多回，唯独这一次，直觉说不会输。</w:t>
+      </w:r>
+    </w:p>
+    <w:p>
+      <w:r>
+        <w:t>这火，值得。</w:t>
+      </w:r>
+    </w:p>
+    <w:p>
+      <w:r>
+        <w:t>这个人，也值得他多看一眼。</w:t>
+      </w:r>
+    </w:p>
+    <w:p>
+      <w:r>
+        <w:t>很值。</w:t>
+      </w:r>
+    </w:p>
+    <w:p>
+      <w:r>
         <w:t>念头转完，不过一瞬。王敦脸上那点惊色早收得干干净净，换上一副“勉为其难”的嫌弃表情，慢悠悠地站起身，拍了拍道袍上的灰。</w:t>
       </w:r>
     </w:p>
@@ -1354,6 +1904,81 @@
     </w:p>
     <w:p>
       <w:r>
+        <w:t>那一瞬间，王敦忽然明白一件事。</w:t>
+      </w:r>
+    </w:p>
+    <w:p>
+      <w:r>
+        <w:t>这小子不是好骗。</w:t>
+      </w:r>
+    </w:p>
+    <w:p>
+      <w:r>
+        <w:t>他是明知道王敦在糊弄账，明知道这半瓶花粉不干净，还是愿意把瓶子递过来。</w:t>
+      </w:r>
+    </w:p>
+    <w:p>
+      <w:r>
+        <w:t>因为王敦刚才那几句话里，有一半是歪理，也有一半是真话。灵药谷的规矩从来不是给底下人活命用的，是给上头人吃肉用的。贺平生未必能把这些弯弯绕绕全想明白，可他能分得清谁是在拿他当草芥，谁是在用最难听的话，教他别被草芥一样踩死。</w:t>
+      </w:r>
+    </w:p>
+    <w:p>
+      <w:r>
+        <w:t>这个判断，比火灵力还稀罕。</w:t>
+      </w:r>
+    </w:p>
+    <w:p>
+      <w:r>
+        <w:t>王敦盯着那瓶花粉，心底那点玩笑慢慢沉下去。他曾经在齐国皇监里见过太多“聪明人”。有人会审时度势，有人会跪得漂亮，有人能把同伴卖个好价钱。可真正能在污水里分清一点点好坏、分清一点点人味的人，少得可怜。</w:t>
+      </w:r>
+    </w:p>
+    <w:p>
+      <w:r>
+        <w:t>贺平生偏是这种人。</w:t>
+      </w:r>
+    </w:p>
+    <w:p>
+      <w:r>
+        <w:t>这就麻烦得更厉害。</w:t>
+      </w:r>
+    </w:p>
+    <w:p>
+      <w:r>
+        <w:t>火纯，心也硬。拿来当供火弟子，太值；拿来当普通杂役，又太亏；若真让枯木那老东西盯上，迟早得被磨成一截只会烧火的木炭。</w:t>
+      </w:r>
+    </w:p>
+    <w:p>
+      <w:r>
+        <w:t>王敦不喜欢麻烦。</w:t>
+      </w:r>
+    </w:p>
+    <w:p>
+      <w:r>
+        <w:t>可他更不喜欢到手的好苗子，被别人糟蹋。</w:t>
+      </w:r>
+    </w:p>
+    <w:p>
+      <w:r>
+        <w:t>“行啊。”他心里那本账册，悄悄翻开了第一页，“半瓶花粉，算老子欠你一次。”</w:t>
+      </w:r>
+    </w:p>
+    <w:p>
+      <w:r>
+        <w:t>这话没出口。</w:t>
+      </w:r>
+    </w:p>
+    <w:p>
+      <w:r>
+        <w:t>出口就显得太正经了。</w:t>
+      </w:r>
+    </w:p>
+    <w:p>
+      <w:r>
+        <w:t>太正经的王敦，容易吓着人。</w:t>
+      </w:r>
+    </w:p>
+    <w:p>
+      <w:r>
         <w:t>他盯着那半瓶粉看了片刻，忽然嗤笑一声，伸手接过。</w:t>
       </w:r>
     </w:p>
@@ -1607,6 +2232,56 @@
     </w:p>
     <w:p>
       <w:r>
+        <w:t>第二年，他学会了买消息。</w:t>
+      </w:r>
+    </w:p>
+    <w:p>
+      <w:r>
+        <w:t>不是去那些挂着牌匾、香炉里烧着沉水香的大商楼买。那种地方账册太干净，来往的人也太记仇，一个黑脸散修多问两句“齐国探子往哪儿走”，第二天就能被卖到皇室暗桩手里。他买的是下九流的消息：脚夫喝醉后的闲话、车把式口里的路况、棺材铺掌柜记下的死者名录、赌坊里输红眼的修士骂出的半截真话。</w:t>
+      </w:r>
+    </w:p>
+    <w:p>
+      <w:r>
+        <w:t>这些东西脏，碎，假话多。</w:t>
+      </w:r>
+    </w:p>
+    <w:p>
+      <w:r>
+        <w:t>可拼起来，反而能看见活路。</w:t>
+      </w:r>
+    </w:p>
+    <w:p>
+      <w:r>
+        <w:t>王敦就是靠这些碎消息，一点点摸清了齐国追捕他的路数。哪一郡贴了新画像，哪一城来了皇监旧人，哪个海捕头目爱把探子扮成卖药郎中，哪个化神供奉一出门必有三只赤羽信鸦先行。他把这些全记在脑子里，夜里睡不着时，一条一条过。</w:t>
+      </w:r>
+    </w:p>
+    <w:p>
+      <w:r>
+        <w:t>过得久了，他甚至有点想笑。</w:t>
+      </w:r>
+    </w:p>
+    <w:p>
+      <w:r>
+        <w:t>齐国那么大，皇室那么威风，抓他一个小小逃犯，动用的人手、灵石、法器，足够养活十个边境小宗门。可偏偏他们越是郑重，越像承认一件事：那个从天牢里爬出去的王敦，真把他们吓着了。</w:t>
+      </w:r>
+    </w:p>
+    <w:p>
+      <w:r>
+        <w:t>这念头让他爽。</w:t>
+      </w:r>
+    </w:p>
+    <w:p>
+      <w:r>
+        <w:t>也让他更警醒。</w:t>
+      </w:r>
+    </w:p>
+    <w:p>
+      <w:r>
+        <w:t>能吓着皇室的人，通常活不长。</w:t>
+      </w:r>
+    </w:p>
+    <w:p>
+      <w:r>
         <w:t>就是那一夜，他想明白了一件压在心口许久的事。</w:t>
       </w:r>
     </w:p>
@@ -1923,6 +2598,66 @@
     <w:p>
       <w:r>
         <w:t>哪怕只有这一个人。</w:t>
+      </w:r>
+    </w:p>
+    <w:p>
+      <w:r>
+        <w:t>被认出来的那一瞬，王敦心里其实松了一口气。</w:t>
+      </w:r>
+    </w:p>
+    <w:p>
+      <w:r>
+        <w:t>这几年他顶着太多张脸活过。</w:t>
+      </w:r>
+    </w:p>
+    <w:p>
+      <w:r>
+        <w:t>红脸大汉，黄脸病夫，瘦削道人，收尸脚夫，游方郎中。每一张脸都有自己的口音、习惯、来历和退路。换得多了，人会有种很古怪的空心感。走到水边洗脸时，他常常看见一张陌生面皮贴在自己脸上，嘴角也会下意识摆出那张脸该有的笑。</w:t>
+      </w:r>
+    </w:p>
+    <w:p>
+      <w:r>
+        <w:t>笑完，他才想起自己原来该露白牙。</w:t>
+      </w:r>
+    </w:p>
+    <w:p>
+      <w:r>
+        <w:t>该骂老子。</w:t>
+      </w:r>
+    </w:p>
+    <w:p>
+      <w:r>
+        <w:t>该黑着一张脸，宽肩厚背，站哪儿都像能把门框挤歪。</w:t>
+      </w:r>
+    </w:p>
+    <w:p>
+      <w:r>
+        <w:t>可这些东西，没人记得。</w:t>
+      </w:r>
+    </w:p>
+    <w:p>
+      <w:r>
+        <w:t>没人敢记。</w:t>
+      </w:r>
+    </w:p>
+    <w:p>
+      <w:r>
+        <w:t>他自己也不敢太常记。</w:t>
+      </w:r>
+    </w:p>
+    <w:p>
+      <w:r>
+        <w:t>所以贺平生那一句“你是不是姓王”，像一只手，忽然把他从那一堆假脸里拽了出来。王敦差点没当场笑出声，又差点有点鼻酸。</w:t>
+      </w:r>
+    </w:p>
+    <w:p>
+      <w:r>
+        <w:t>娘的。</w:t>
+      </w:r>
+    </w:p>
+    <w:p>
+      <w:r>
+        <w:t>这费钱货，眼睛是真毒。</w:t>
       </w:r>
     </w:p>
     <w:p>
@@ -2430,6 +3165,71 @@
     </w:p>
     <w:p>
       <w:r>
+        <w:t>这才是王敦最熟悉的大齐。</w:t>
+      </w:r>
+    </w:p>
+    <w:p>
+      <w:r>
+        <w:t>它抓人，从来不怕抓错。抓错一个，叫误伤；抓错一百个，叫肃清；抓错一座城，那就是替皇室分忧。齐国皇监里那些铁门背后，有多少人是这么被“顺手”关进去的，王敦心里有数。</w:t>
+      </w:r>
+    </w:p>
+    <w:p>
+      <w:r>
+        <w:t>当年跟他同一层牢里的，有个卖符纸的老头。罪名是私藏禁符。其实那老头只是在集市上卖过一张破旧遁符，恰好被皇室追捕的人用过。于是人进了天牢，摊子抄了，孙女也没了下落。老头在第七层熬了半年，熬到最后，连自己到底犯了什么罪都记不清，只剩一句“我没见过那人”翻来覆去地念。</w:t>
+      </w:r>
+    </w:p>
+    <w:p>
+      <w:r>
+        <w:t>王敦那时不懂。</w:t>
+      </w:r>
+    </w:p>
+    <w:p>
+      <w:r>
+        <w:t>后来懂了。</w:t>
+      </w:r>
+    </w:p>
+    <w:p>
+      <w:r>
+        <w:t>这世道压根不需要你真犯错。只要你站得离麻烦近一点，麻烦就会把你的影子也吞进去。</w:t>
+      </w:r>
+    </w:p>
+    <w:p>
+      <w:r>
+        <w:t>如今这座定襄城，正变成另一座天牢。</w:t>
+      </w:r>
+    </w:p>
+    <w:p>
+      <w:r>
+        <w:t>几十万修士排着队过镜，个个以为自己只是照一下，证明清白。可等“作弊”两个字一落，清白就不值钱了。谁的来路不够干净，谁的表情不够自然，谁曾跟一个可疑之人说过三句话，都能被拎出来。若有人不服，城主府只需把九龙宝镜往上头一摆。</w:t>
+      </w:r>
+    </w:p>
+    <w:p>
+      <w:r>
+        <w:t>镇国至宝面前，你辩什么？</w:t>
+      </w:r>
+    </w:p>
+    <w:p>
+      <w:r>
+        <w:t>王敦端着粗瓷碗，忽然觉得那凉茶苦得发涩。</w:t>
+      </w:r>
+    </w:p>
+    <w:p>
+      <w:r>
+        <w:t>他不能把这张网等到收口。</w:t>
+      </w:r>
+    </w:p>
+    <w:p>
+      <w:r>
+        <w:t>更不能赌城主府讲理。</w:t>
+      </w:r>
+    </w:p>
+    <w:p>
+      <w:r>
+        <w:t>讲理这东西，只有两边都怕撕破脸时才值钱。现在一边握着宝镜，一边只是几十万散修的命，哪来的理？</w:t>
+      </w:r>
+    </w:p>
+    <w:p>
+      <w:r>
         <w:t>王敦端着那碗凉茶，指节捏得发白，后槽牙咬得咯咯响。</w:t>
       </w:r>
     </w:p>
@@ -2811,6 +3611,61 @@
     <w:p>
       <w:r>
         <w:t>这三息，比他在天牢里熬的那一千零九十五天还要难捱。</w:t>
+      </w:r>
+    </w:p>
+    <w:p>
+      <w:r>
+        <w:t>第一息，他已经把回城的路算完了。</w:t>
+      </w:r>
+    </w:p>
+    <w:p>
+      <w:r>
+        <w:t>从西门折回去，穿货市，钻酒肆后巷，再从城隍庙那条塌了一半的暗沟摸到山神庙附近。若只是救人，未必没有机会。贺平生修为不高，却不是软骨头，真被盘问，多半一时半会儿不会吐。只要王敦赶在城主府把人带进镜阵前，把人抢出来，再借乱出城，兴许还能活。</w:t>
+      </w:r>
+    </w:p>
+    <w:p>
+      <w:r>
+        <w:t>第二息，他又把这条路推翻。</w:t>
+      </w:r>
+    </w:p>
+    <w:p>
+      <w:r>
+        <w:t>城里已经敲锣，说明细筛开始了。山神庙附近必有暗哨，城主府等的就是他舍不得这条线、忍不住回头。只要他一现身，九龙宝镜一照，别说贺平生，整条街都得被拖进来陪葬。</w:t>
+      </w:r>
+    </w:p>
+    <w:p>
+      <w:r>
+        <w:t>第三息，他什么都没算。</w:t>
+      </w:r>
+    </w:p>
+    <w:p>
+      <w:r>
+        <w:t>他只想起贺平生在灵药谷那夜，默默把半瓶花粉递给他的样子。</w:t>
+      </w:r>
+    </w:p>
+    <w:p>
+      <w:r>
+        <w:t>那双手很稳。</w:t>
+      </w:r>
+    </w:p>
+    <w:p>
+      <w:r>
+        <w:t>稳得像信他。</w:t>
+      </w:r>
+    </w:p>
+    <w:p>
+      <w:r>
+        <w:t>王敦最怕别人信他。</w:t>
+      </w:r>
+    </w:p>
+    <w:p>
+      <w:r>
+        <w:t>因为信了，他就欠。</w:t>
+      </w:r>
+    </w:p>
+    <w:p>
+      <w:r>
+        <w:t>欠了，就得还。</w:t>
       </w:r>
     </w:p>
     <w:p>
@@ -3018,6 +3873,76 @@
     </w:p>
     <w:p>
       <w:r>
+        <w:t>这三十年里，王敦不止一次想过把那张替死符送出去。</w:t>
+      </w:r>
+    </w:p>
+    <w:p>
+      <w:r>
+        <w:t>最早是在乱石滩。那时候他被一群齐国暗探追到断崖边，自己都差点活不下来，却在半夜疗伤时，忽然摸到怀里的符，想起定襄城门里那个被自己留下的小师弟。他当时疼得满身冷汗，咬着牙骂：“等老子缓过这口气，先把这东西送出去。”</w:t>
+      </w:r>
+    </w:p>
+    <w:p>
+      <w:r>
+        <w:t>后来缓过来了。</w:t>
+      </w:r>
+    </w:p>
+    <w:p>
+      <w:r>
+        <w:t>又不敢送。</w:t>
+      </w:r>
+    </w:p>
+    <w:p>
+      <w:r>
+        <w:t>不是舍不得。</w:t>
+      </w:r>
+    </w:p>
+    <w:p>
+      <w:r>
+        <w:t>是找不到人，也不能找。只要他主动去寻贺平生，就会把齐国的眼线也一并带过去。那小子好不容易从定襄城那张网里活下来，再被他这条九龙牵连一次，未免太冤。</w:t>
+      </w:r>
+    </w:p>
+    <w:p>
+      <w:r>
+        <w:t>于是他只能等。</w:t>
+      </w:r>
+    </w:p>
+    <w:p>
+      <w:r>
+        <w:t>等消息，等时机，等一个能在人海里远远看见贺平生、又不把祸水泼过去的机会。</w:t>
+      </w:r>
+    </w:p>
+    <w:p>
+      <w:r>
+        <w:t>等到今日九国大比。</w:t>
+      </w:r>
+    </w:p>
+    <w:p>
+      <w:r>
+        <w:t>这地方人多，眼杂，势力混在一处，齐国就算盯着，也不敢明目张胆把半座擂台掀了。室女国的名册给了他一个台面，梁国的看台给了贺平生一个去处。两个被命运绕了三十年的倒霉师兄弟，终于在几万双眼睛底下，反倒有了片刻能说私话的暗角。</w:t>
+      </w:r>
+    </w:p>
+    <w:p>
+      <w:r>
+        <w:t>王敦嘴上还是嗑瓜子，心里却早把这事盘了三遍。</w:t>
+      </w:r>
+    </w:p>
+    <w:p>
+      <w:r>
+        <w:t>今日必须送。</w:t>
+      </w:r>
+    </w:p>
+    <w:p>
+      <w:r>
+        <w:t>送完，这账才不压心口。</w:t>
+      </w:r>
+    </w:p>
+    <w:p>
+      <w:r>
+        <w:t>哪怕送完以后，他自己的命，只剩一张符兜底。</w:t>
+      </w:r>
+    </w:p>
+    <w:p>
+      <w:r>
         <w:t>他低头，从怀里那个最贴身的暗袋里，隔着衣料，轻轻碰了碰那样东西。</w:t>
       </w:r>
     </w:p>
@@ -3259,6 +4184,56 @@
     <w:p>
       <w:r>
         <w:t>两张符，一张给了人，自己剩下的，就只这一张了。</w:t>
+      </w:r>
+    </w:p>
+    <w:p>
+      <w:r>
+        <w:t>替死符贴身离开的一瞬，他甚至有种古怪的轻。</w:t>
+      </w:r>
+    </w:p>
+    <w:p>
+      <w:r>
+        <w:t>像少了一条命。</w:t>
+      </w:r>
+    </w:p>
+    <w:p>
+      <w:r>
+        <w:t>也像少了一副枷锁。</w:t>
+      </w:r>
+    </w:p>
+    <w:p>
+      <w:r>
+        <w:t>从前两张符在怀里，他总忍不住算：这一张什么时候用，那一张留到哪一劫；若遇化神围杀，先烧哪张；若齐国宝镜照来，又该保哪条退路。算得久了，连命都像账本上的数字。</w:t>
+      </w:r>
+    </w:p>
+    <w:p>
+      <w:r>
+        <w:t>如今其中一张落到贺平生手里，这账本忽然多了点人味。</w:t>
+      </w:r>
+    </w:p>
+    <w:p>
+      <w:r>
+        <w:t>那不是“损失一条命”。</w:t>
+      </w:r>
+    </w:p>
+    <w:p>
+      <w:r>
+        <w:t>是他终于能把三十年前城门阴影里那句“连本带利还你”，从心里拿出来，放到一个真正的人手上。</w:t>
+      </w:r>
+    </w:p>
+    <w:p>
+      <w:r>
+        <w:t>值不值？</w:t>
+      </w:r>
+    </w:p>
+    <w:p>
+      <w:r>
+        <w:t>值。</w:t>
+      </w:r>
+    </w:p>
+    <w:p>
+      <w:r>
+        <w:t>王敦这个人，平日里能为三块灵石跟人掰扯半天，真到这种时候，反倒不太会算小账。</w:t>
       </w:r>
     </w:p>
     <w:p>
@@ -3591,6 +4566,51 @@
     </w:p>
     <w:p>
       <w:r>
+        <w:t>王敦最怕的从来不是花活儿。</w:t>
+      </w:r>
+    </w:p>
+    <w:p>
+      <w:r>
+        <w:t>他怕的是看不见底。</w:t>
+      </w:r>
+    </w:p>
+    <w:p>
+      <w:r>
+        <w:t>齐国天牢那九道锁链，看似死物，底下却藏着换气；九龙宝镜看似验身，底下藏着杀局；空灵根看似千变万化，底下也必有一个人本身的极限。只要摸到那个极限，再漂亮的变化，都有破口。</w:t>
+      </w:r>
+    </w:p>
+    <w:p>
+      <w:r>
+        <w:t>萧玄的破口，就在“傲”字上。</w:t>
+      </w:r>
+    </w:p>
+    <w:p>
+      <w:r>
+        <w:t>他太相信自己的空灵根，也太相信九国大比里那些被他玩弄过的同辈。这样的人，出招喜欢留余地给自己欣赏，喜欢把对手困在变化里慢慢磨死。他不会一上来就拿命搏，因为他觉得不配。</w:t>
+      </w:r>
+    </w:p>
+    <w:p>
+      <w:r>
+        <w:t>王敦偏要逼他配。</w:t>
+      </w:r>
+    </w:p>
+    <w:p>
+      <w:r>
+        <w:t>逼他一招比一招重，逼他把那些漂亮变化全掏出来，最后再用最不讲理的一拳，把这一身花哨全砸碎。</w:t>
+      </w:r>
+    </w:p>
+    <w:p>
+      <w:r>
+        <w:t>这不是单纯为了赢。</w:t>
+      </w:r>
+    </w:p>
+    <w:p>
+      <w:r>
+        <w:t>是为了让台下那群看客，尤其是东边齐国看台上那几双阴冷眼睛，明白一件事：这个黑脸管事若真是猎物，也是一头会咬断猎人手腕的猎物。</w:t>
+      </w:r>
+    </w:p>
+    <w:p>
+      <w:r>
         <w:t>心里有了底，脸上却半分不露。</w:t>
       </w:r>
     </w:p>
@@ -3777,6 +4797,76 @@
     <w:p>
       <w:r>
         <w:t>几万双眼睛，直勾勾地盯着台心那个黑脸管事，连呼吸都忘了。</w:t>
+      </w:r>
+    </w:p>
+    <w:p>
+      <w:r>
+        <w:t>这种死寂，比方才的哄笑更叫王敦受用。</w:t>
+      </w:r>
+    </w:p>
+    <w:p>
+      <w:r>
+        <w:t>哄笑是他们以为自己看见了笑话。</w:t>
+      </w:r>
+    </w:p>
+    <w:p>
+      <w:r>
+        <w:t>死寂是他们终于发现，笑话会挥拳。</w:t>
+      </w:r>
+    </w:p>
+    <w:p>
+      <w:r>
+        <w:t>室女国看台上，那些原本嫌他丢人的女修，一个个僵在那里。有人手里的茶盏倾了半寸，茶水淌到衣袖上也没察觉；有人看着台上那片还没散尽的火光，嘴唇动了动，却一句话都说不出来。</w:t>
+      </w:r>
+    </w:p>
+    <w:p>
+      <w:r>
+        <w:t>梁画秋最先回过神。</w:t>
+      </w:r>
+    </w:p>
+    <w:p>
+      <w:r>
+        <w:t>她的脸色很复杂。</w:t>
+      </w:r>
+    </w:p>
+    <w:p>
+      <w:r>
+        <w:t>不是单纯的惊，也不是单纯的喜。更像是终于明白，自己这些日子看见的那个嗑瓜子、躲懒、满嘴歪理的黑脸管事，只是这个人故意摆在外头的一层壳。</w:t>
+      </w:r>
+    </w:p>
+    <w:p>
+      <w:r>
+        <w:t>壳碎开的瞬间，里头不是粗鄙。</w:t>
+      </w:r>
+    </w:p>
+    <w:p>
+      <w:r>
+        <w:t>是锋芒。</w:t>
+      </w:r>
+    </w:p>
+    <w:p>
+      <w:r>
+        <w:t>王敦余光扫过她，心里有点得意，又有点警醒。</w:t>
+      </w:r>
+    </w:p>
+    <w:p>
+      <w:r>
+        <w:t>亮底牌就是这样。</w:t>
+      </w:r>
+    </w:p>
+    <w:p>
+      <w:r>
+        <w:t>爽是爽，亮也是真亮。亮给室女国看，亮给九国看，也亮给了东边齐国那几双老眼。</w:t>
+      </w:r>
+    </w:p>
+    <w:p>
+      <w:r>
+        <w:t>可这一拳不打不行。</w:t>
+      </w:r>
+    </w:p>
+    <w:p>
+      <w:r>
+        <w:t>人情债要还，室女国的脸要挣，贺平生也在台下看着。他王敦若在这里缩了，往后再说什么“跟着王师兄亏不了你”，自己都嫌臊。</w:t>
       </w:r>
     </w:p>
     <w:p>
@@ -4204,6 +5294,51 @@
     </w:p>
     <w:p>
       <w:r>
+        <w:t>他不是没看见梁画秋眼底那点松动。</w:t>
+      </w:r>
+    </w:p>
+    <w:p>
+      <w:r>
+        <w:t>一个从小在室女国清规里长大的冷脸姑娘，能把“你有难处”四个字说出口，已经算很大的让步。王敦若顺杆往上爬，未必不能把室女国也拉进自己的保命局里。振羽老祖欠他人情，梁画秋又刚见过他台上那一拳，真要开口，室女国至少能替他遮一遮。</w:t>
+      </w:r>
+    </w:p>
+    <w:p>
+      <w:r>
+        <w:t>可遮一遮之后呢？</w:t>
+      </w:r>
+    </w:p>
+    <w:p>
+      <w:r>
+        <w:t>齐国三祖找上门，室女国挡得住吗？</w:t>
+      </w:r>
+    </w:p>
+    <w:p>
+      <w:r>
+        <w:t>挡不住。</w:t>
+      </w:r>
+    </w:p>
+    <w:p>
+      <w:r>
+        <w:t>到时候那些清清冷冷的女修、那个嘴硬心软的梁画秋、那个看似嫌弃却真给过他名册的振羽老祖，全都要被拖进齐国的怒火里。</w:t>
+      </w:r>
+    </w:p>
+    <w:p>
+      <w:r>
+        <w:t>王敦这人混账归混账，账算得却清。</w:t>
+      </w:r>
+    </w:p>
+    <w:p>
+      <w:r>
+        <w:t>救命之恩可以记，彩头人情可以还，红颜知己的种子可以埋。可把别人宗门当自己的挡箭牌，这事他做不出来。</w:t>
+      </w:r>
+    </w:p>
+    <w:p>
+      <w:r>
+        <w:t>“画秋姑娘。”他在人海里没有回头，只在心里轻轻念了一句，“今日这份好意，老子也记下。以后若有机会，换个不连累你的法子还。”</w:t>
+      </w:r>
+    </w:p>
+    <w:p>
+      <w:r>
         <w:t>她不知道的是，王敦那张笑脸一转过去，便沉了下来。</w:t>
       </w:r>
     </w:p>
@@ -4345,6 +5480,41 @@
     <w:p>
       <w:r>
         <w:t>这一束，就是天大的破绽。</w:t>
+      </w:r>
+    </w:p>
+    <w:p>
+      <w:r>
+        <w:t>王敦甚至能闻到他们身上的“稳”。</w:t>
+      </w:r>
+    </w:p>
+    <w:p>
+      <w:r>
+        <w:t>太稳了。</w:t>
+      </w:r>
+    </w:p>
+    <w:p>
+      <w:r>
+        <w:t>稳到每一步都像账房先生拨算盘：先封经脉，再断四肢，再套锁运阵，最后活着送回齐国领赏。他们是化神老祖，站得太高，也活得太久，久到已经忘了低处的人真急眼时，会怎么咬人。</w:t>
+      </w:r>
+    </w:p>
+    <w:p>
+      <w:r>
+        <w:t>天牢里的狱卒也这样。</w:t>
+      </w:r>
+    </w:p>
+    <w:p>
+      <w:r>
+        <w:t>他们以为九道锁链在，王敦就一定跑不了；定襄城主府也这样，以为九龙宝镜一摆，他就一定得往网里钻。人一旦觉得自己稳操胜券，就会把对手先在心里弄死。</w:t>
+      </w:r>
+    </w:p>
+    <w:p>
+      <w:r>
+        <w:t>王敦最喜欢这种时刻。</w:t>
+      </w:r>
+    </w:p>
+    <w:p>
+      <w:r>
+        <w:t>因为只有这种时刻，他这个被人看成猎物的家伙，才有机会把牙，贴到猎人的喉咙上。</w:t>
       </w:r>
     </w:p>
     <w:p>
@@ -4822,6 +5992,91 @@
     </w:p>
     <w:p>
       <w:r>
+        <w:t>路过一家酒肆时，店小二正把一盆热汤端到门口，汤面上飘着葱花和油星，香得朴实。里头有人拍桌笑骂，有人劝酒，有个小姑娘抱着一只木头小虎，从桌底钻出来，险些撞到王敦腿上。</w:t>
+      </w:r>
+    </w:p>
+    <w:p>
+      <w:r>
+        <w:t>王敦本能地往后退了半步。</w:t>
+      </w:r>
+    </w:p>
+    <w:p>
+      <w:r>
+        <w:t>小姑娘仰头看他，眨巴眨巴眼。</w:t>
+      </w:r>
+    </w:p>
+    <w:p>
+      <w:r>
+        <w:t>“叔叔，你脸好黑。”</w:t>
+      </w:r>
+    </w:p>
+    <w:p>
+      <w:r>
+        <w:t>酒肆里顿时有人笑。</w:t>
+      </w:r>
+    </w:p>
+    <w:p>
+      <w:r>
+        <w:t>她娘赶紧把孩子抱回去，连声赔不是。王敦摆摆手，嘴上打了个哈哈：“黑点好，晒得结实，耐打。”</w:t>
+      </w:r>
+    </w:p>
+    <w:p>
+      <w:r>
+        <w:t>众人又笑。</w:t>
+      </w:r>
+    </w:p>
+    <w:p>
+      <w:r>
+        <w:t>他也笑。</w:t>
+      </w:r>
+    </w:p>
+    <w:p>
+      <w:r>
+        <w:t>笑完，继续往前走。</w:t>
+      </w:r>
+    </w:p>
+    <w:p>
+      <w:r>
+        <w:t>走出半条街，那点笑意才慢慢散干净。</w:t>
+      </w:r>
+    </w:p>
+    <w:p>
+      <w:r>
+        <w:t>若是寻常人，被小孩这么冒犯一句，最多回去跟酒桌上的朋友骂两声，喝一碗热汤，睡一觉就过去了。可他不行。他甚至不敢在那酒肆里多坐半刻，不敢让任何人记住他的嗓门、笑声、喝汤的姿势。</w:t>
+      </w:r>
+    </w:p>
+    <w:p>
+      <w:r>
+        <w:t>因为大齐的海捕文书就贴在街口。</w:t>
+      </w:r>
+    </w:p>
+    <w:p>
+      <w:r>
+        <w:t>因为悬赏能买下半条街的人心。</w:t>
+      </w:r>
+    </w:p>
+    <w:p>
+      <w:r>
+        <w:t>因为他王敦这个名字，比瘟疫还招灾。</w:t>
+      </w:r>
+    </w:p>
+    <w:p>
+      <w:r>
+        <w:t>他忽然有点想念灵药谷。</w:t>
+      </w:r>
+    </w:p>
+    <w:p>
+      <w:r>
+        <w:t>想那两口破火塘，想小六子的尖嗓子，想贺平生板着脸供火的样子，甚至想枯木真人那张欠揍的老脸。那地方算不得家，连个像样的窝都不是，可至少在那里，他曾经短暂地像个活人一样，骂过人，算过账，等过一炉火。</w:t>
+      </w:r>
+    </w:p>
+    <w:p>
+      <w:r>
+        <w:t>如今三尊化神一死，这点短暂的像样日子，也彻底烧没了。</w:t>
+      </w:r>
+    </w:p>
+    <w:p>
+      <w:r>
         <w:t>……</w:t>
       </w:r>
     </w:p>
@@ -4988,6 +6243,56 @@
     <w:p>
       <w:r>
         <w:t>从前他怕这身气运，把它当催命符，恨不能藏一辈子。可藏到今天，他想明白了——藏是藏不住的，越藏越憋屈，越憋屈越被人拿捏。九条龙生在他命里，他改不了，那就索性认下来，把它使顺了，使成自己手里的刀，而不是悬在头顶的劫。</w:t>
+      </w:r>
+    </w:p>
+    <w:p>
+      <w:r>
+        <w:t>人就不能只会跑。</w:t>
+      </w:r>
+    </w:p>
+    <w:p>
+      <w:r>
+        <w:t>跑，是为了活。</w:t>
+      </w:r>
+    </w:p>
+    <w:p>
+      <w:r>
+        <w:t>可活到最后，若连自己想护谁、想去哪儿、想喝一碗热汤都得看别人脸色，那也不过是把天牢从地底，搬进了心里。</w:t>
+      </w:r>
+    </w:p>
+    <w:p>
+      <w:r>
+        <w:t>王敦低头看着自己掌心。</w:t>
+      </w:r>
+    </w:p>
+    <w:p>
+      <w:r>
+        <w:t>掌纹粗糙，指节上全是旧伤。天牢的玄铁、灵药谷的花粉、九国大比的血、三祖围杀时碎掉的骨头，全都在这双手上留下过痕迹。它们不漂亮，也不干净，却是他一点点从死局里抠出来的本钱。</w:t>
+      </w:r>
+    </w:p>
+    <w:p>
+      <w:r>
+        <w:t>他忽然把那张替死符重新展开，指腹在符纹上慢慢按过。</w:t>
+      </w:r>
+    </w:p>
+    <w:p>
+      <w:r>
+        <w:t>这东西能替他死一次。</w:t>
+      </w:r>
+    </w:p>
+    <w:p>
+      <w:r>
+        <w:t>可它替不了他活。</w:t>
+      </w:r>
+    </w:p>
+    <w:p>
+      <w:r>
+        <w:t>要活得像个人，还得靠他自己往上爬。</w:t>
+      </w:r>
+    </w:p>
+    <w:p>
+      <w:r>
+        <w:t>往上爬到有朝一日，再有人拿镜子照他、拿天牢困他、拿旁人逼他时，他能站在那里，笑着把对方的镜子砸碎，而不是转身就跑。</w:t>
       </w:r>
     </w:p>
     <w:p>
@@ -5365,6 +6670,91 @@
     </w:p>
     <w:p>
       <w:r>
+        <w:t>进去之前，王敦把自己剩下的那张替死符摸了一遍。</w:t>
+      </w:r>
+    </w:p>
+    <w:p>
+      <w:r>
+        <w:t>符还在。</w:t>
+      </w:r>
+    </w:p>
+    <w:p>
+      <w:r>
+        <w:t>薄薄一张，贴着心口，像最后一道不讲理的门闩。</w:t>
+      </w:r>
+    </w:p>
+    <w:p>
+      <w:r>
+        <w:t>他本想装作随意，问问贺平生那张符有没有带好。话到嘴边又咽了回去。那小子心细，真听出他话里的担心，八成又要板着脸说“师兄放心”。王敦最受不了这四个字。</w:t>
+      </w:r>
+    </w:p>
+    <w:p>
+      <w:r>
+        <w:t>放心？</w:t>
+      </w:r>
+    </w:p>
+    <w:p>
+      <w:r>
+        <w:t>进天极绝地这种地方，谁放心谁是傻子。</w:t>
+      </w:r>
+    </w:p>
+    <w:p>
+      <w:r>
+        <w:t>于是他换了个说法。</w:t>
+      </w:r>
+    </w:p>
+    <w:p>
+      <w:r>
+        <w:t>“老弟。”王敦边走边压低声音，“一会儿真遇上事，别跟老子讲义气。该跑跑，该躲躲。你那张符不是摆设，真到必死关头，别省。”</w:t>
+      </w:r>
+    </w:p>
+    <w:p>
+      <w:r>
+        <w:t>贺平生看他一眼。</w:t>
+      </w:r>
+    </w:p>
+    <w:p>
+      <w:r>
+        <w:t>“你呢？”</w:t>
+      </w:r>
+    </w:p>
+    <w:p>
+      <w:r>
+        <w:t>“老子命硬。”</w:t>
+      </w:r>
+    </w:p>
+    <w:p>
+      <w:r>
+        <w:t>“你也别省。”</w:t>
+      </w:r>
+    </w:p>
+    <w:p>
+      <w:r>
+        <w:t>王敦被噎住，半晌才骂：“你这人，真没意思。”</w:t>
+      </w:r>
+    </w:p>
+    <w:p>
+      <w:r>
+        <w:t>贺平生道：“彼此。”</w:t>
+      </w:r>
+    </w:p>
+    <w:p>
+      <w:r>
+        <w:t>王敦笑骂一句，心里却莫名踏实了些。</w:t>
+      </w:r>
+    </w:p>
+    <w:p>
+      <w:r>
+        <w:t>有些话不必说透。</w:t>
+      </w:r>
+    </w:p>
+    <w:p>
+      <w:r>
+        <w:t>他们都清楚，这趟死地里，谁也不会真把谁丢下。</w:t>
+      </w:r>
+    </w:p>
+    <w:p>
+      <w:r>
         <w:t>……</w:t>
       </w:r>
     </w:p>
@@ -5740,6 +7130,76 @@
     </w:p>
     <w:p>
       <w:r>
+        <w:t>他甚至开始后悔。</w:t>
+      </w:r>
+    </w:p>
+    <w:p>
+      <w:r>
+        <w:t>不是后悔来争时空本源。</w:t>
+      </w:r>
+    </w:p>
+    <w:p>
+      <w:r>
+        <w:t>修士这一生，本就是拿命换路。真为机缘死在死地里，怨不得谁。</w:t>
+      </w:r>
+    </w:p>
+    <w:p>
+      <w:r>
+        <w:t>他后悔的是把贺平生带进来。</w:t>
+      </w:r>
+    </w:p>
+    <w:p>
+      <w:r>
+        <w:t>若只有他一个人，死便死了。齐国追杀也好，九龙气运也罢，折在这里，顶多算他王敦这条赖命终于赖到头。可眼下贺平生也跪在焦土里，半身青黑，嘴唇被毒气染得发紫。</w:t>
+      </w:r>
+    </w:p>
+    <w:p>
+      <w:r>
+        <w:t>那张替死符在贺平生怀里。</w:t>
+      </w:r>
+    </w:p>
+    <w:p>
+      <w:r>
+        <w:t>能保命。</w:t>
+      </w:r>
+    </w:p>
+    <w:p>
+      <w:r>
+        <w:t>可保一回命，挡不了熔炉，挡不了神毒，也挡不了这片吃人的树海。符裂之后，若他们还破不了局，还是死。</w:t>
+      </w:r>
+    </w:p>
+    <w:p>
+      <w:r>
+        <w:t>王敦脑子里乱得厉害，偏偏越乱，越能想起一些没用的细节。</w:t>
+      </w:r>
+    </w:p>
+    <w:p>
+      <w:r>
+        <w:t>想起灵药谷那夜，贺平生抱着柴问他火候够不够。</w:t>
+      </w:r>
+    </w:p>
+    <w:p>
+      <w:r>
+        <w:t>想起定襄城山神庙里，他把半瓶花粉塞过去，叫人别供出他。</w:t>
+      </w:r>
+    </w:p>
+    <w:p>
+      <w:r>
+        <w:t>想起九国大比后廊，替死符被贺平生收进怀里时，那小子眼眶发红，却一句矫情话都没说。</w:t>
+      </w:r>
+    </w:p>
+    <w:p>
+      <w:r>
+        <w:t>这些账，他还没还完。</w:t>
+      </w:r>
+    </w:p>
+    <w:p>
+      <w:r>
+        <w:t>他怎么能把人带到这里，一起死？</w:t>
+      </w:r>
+    </w:p>
+    <w:p>
+      <w:r>
         <w:t>“老弟……”他偏过头，扯出一个比哭还难看的笑，“看样子，今儿这关，悬了。”</w:t>
       </w:r>
     </w:p>
@@ -5856,6 +7316,56 @@
     <w:p>
       <w:r>
         <w:t>王敦的眼眶，毫无征兆地，热了一下。</w:t>
+      </w:r>
+    </w:p>
+    <w:p>
+      <w:r>
+        <w:t>他忽然想起第七层天牢里的废沟。</w:t>
+      </w:r>
+    </w:p>
+    <w:p>
+      <w:r>
+        <w:t>那一年，他从污水里爬出去时，心里只有一个念头：只要老子活。</w:t>
+      </w:r>
+    </w:p>
+    <w:p>
+      <w:r>
+        <w:t>活着就好。</w:t>
+      </w:r>
+    </w:p>
+    <w:p>
+      <w:r>
+        <w:t>活着才能逃，才能骂，才能把齐国那帮老东西气得跳脚。</w:t>
+      </w:r>
+    </w:p>
+    <w:p>
+      <w:r>
+        <w:t>后来，他在定襄城门的阴影里，第一次觉得“只要老子活”这句话不够用了。因为他活了，祸却烧到贺平生身上。</w:t>
+      </w:r>
+    </w:p>
+    <w:p>
+      <w:r>
+        <w:t>再后来，他送出替死符，以为自己总算还了一笔。</w:t>
+      </w:r>
+    </w:p>
+    <w:p>
+      <w:r>
+        <w:t>直到此刻，他才明白，这笔账从来不是一张符能算完的。</w:t>
+      </w:r>
+    </w:p>
+    <w:p>
+      <w:r>
+        <w:t>兄弟不是你欠我一回、我还你一命那么简单。是当死局压下来时，你明明最会跑，却会停一步；他明明最该拿着符自保，却会把手伸过来。</w:t>
+      </w:r>
+    </w:p>
+    <w:p>
+      <w:r>
+        <w:t>王敦这辈子最信逃路，最怕牵挂。</w:t>
+      </w:r>
+    </w:p>
+    <w:p>
+      <w:r>
+        <w:t>可这只手伸在面前，他竟然一点也不想躲。</w:t>
       </w:r>
     </w:p>
     <w:p>
@@ -6193,6 +7703,56 @@
     </w:p>
     <w:p>
       <w:r>
+        <w:t>王敦看着她那副认真样，忽然有点头疼。</w:t>
+      </w:r>
+    </w:p>
+    <w:p>
+      <w:r>
+        <w:t>收徒这事，听着威风，真落到身上，竟比被人追杀还麻烦。被追杀时，他只管自己跑，跑快点、藏深点、嘴欠点，活下来就算赢。可徒弟不一样。徒弟会看你怎么坐、怎么说话、怎么坑人，连你随口一句歪理，她都可能当成真经。</w:t>
+      </w:r>
+    </w:p>
+    <w:p>
+      <w:r>
+        <w:t>这责任来得莫名其妙。</w:t>
+      </w:r>
+    </w:p>
+    <w:p>
+      <w:r>
+        <w:t>他王敦自己都没活明白呢，怎么就成老祖了？</w:t>
+      </w:r>
+    </w:p>
+    <w:p>
+      <w:r>
+        <w:t>可慕容纤纤站在那儿，眼睛亮得像刚点着的小灯，王敦又说不出“别跟我学”这种话。</w:t>
+      </w:r>
+    </w:p>
+    <w:p>
+      <w:r>
+        <w:t>真灵谷这些年被外头势力压得抬不起头，谷里的年轻弟子大多没见过什么大场面，一听见他从天极绝地活着回来，就把他当成能镇住风雨的靠山。王敦知道自己不是。他只是命硬，嘴硬，外加运气坏到极处又会反弹。</w:t>
+      </w:r>
+    </w:p>
+    <w:p>
+      <w:r>
+        <w:t>但靠山这东西，有时候不一定非得真高。</w:t>
+      </w:r>
+    </w:p>
+    <w:p>
+      <w:r>
+        <w:t>只要底下人抬头时，看见那里有人站着，就能多一口胆气。</w:t>
+      </w:r>
+    </w:p>
+    <w:p>
+      <w:r>
+        <w:t>“罢了。”王敦在心里叹气，“老子先站一站。”</w:t>
+      </w:r>
+    </w:p>
+    <w:p>
+      <w:r>
+        <w:t>站得住多久算多久。</w:t>
+      </w:r>
+    </w:p>
+    <w:p>
+      <w:r>
         <w:t>最妙的是，他借着这“出关”，把元婴期那点虚浮的修为，硬生生稳到了八层圆满。</w:t>
       </w:r>
     </w:p>
@@ -6229,6 +7789,81 @@
     <w:p>
       <w:r>
         <w:t>欠的情，他王敦这辈子，从来都是用别的法子还。</w:t>
+      </w:r>
+    </w:p>
+    <w:p>
+      <w:r>
+        <w:t>这个“别的法子”，他想了好几日。</w:t>
+      </w:r>
+    </w:p>
+    <w:p>
+      <w:r>
+        <w:t>送丹药，太正经。</w:t>
+      </w:r>
+    </w:p>
+    <w:p>
+      <w:r>
+        <w:t>送法器，又像还账。</w:t>
+      </w:r>
+    </w:p>
+    <w:p>
+      <w:r>
+        <w:t>拉着贺平生喝酒，说几句“这回多亏你”，王敦光想想就浑身发麻。那小子一旦认真回一句“师兄不必如此”，他怕自己能当场从真灵谷飞出去。</w:t>
+      </w:r>
+    </w:p>
+    <w:p>
+      <w:r>
+        <w:t>最后还是慕容纤纤给了他灵感。</w:t>
+      </w:r>
+    </w:p>
+    <w:p>
+      <w:r>
+        <w:t>那丫头来送药时，提起谷外有个采药少女，因被妖藤缠住，差点折在山涧里，后来被一位青衫修士顺手救了。少女回谷后羞得不行，逢人便问那位青衫恩人姓甚名谁。</w:t>
+      </w:r>
+    </w:p>
+    <w:p>
+      <w:r>
+        <w:t>王敦一听就乐了。</w:t>
+      </w:r>
+    </w:p>
+    <w:p>
+      <w:r>
+        <w:t>这不就有了？</w:t>
+      </w:r>
+    </w:p>
+    <w:p>
+      <w:r>
+        <w:t>救命之恩，姑娘情思，贴身信物，寻人报恩。多好的胡扯材料。</w:t>
+      </w:r>
+    </w:p>
+    <w:p>
+      <w:r>
+        <w:t>他当然知道这事多半只是少女春心一动，跟贺平生八字没一撇。可他要的不是撮合，是真把贺平生从天极绝地那场沉重里拽出来，让这小子脸红一回，活人一点。</w:t>
+      </w:r>
+    </w:p>
+    <w:p>
+      <w:r>
+        <w:t>一个人若总把生死、苍生、道义压在肩上，迟早会被压成一块石头。</w:t>
+      </w:r>
+    </w:p>
+    <w:p>
+      <w:r>
+        <w:t>王敦不想让贺平生成石头。</w:t>
+      </w:r>
+    </w:p>
+    <w:p>
+      <w:r>
+        <w:t>所以他决定，送一方红肚兜。</w:t>
+      </w:r>
+    </w:p>
+    <w:p>
+      <w:r>
+        <w:t>缺德是缺德。</w:t>
+      </w:r>
+    </w:p>
+    <w:p>
+      <w:r>
+        <w:t>管用就行。</w:t>
       </w:r>
     </w:p>
     <w:p>
@@ -6421,6 +8056,81 @@
     </w:p>
     <w:p>
       <w:r>
+        <w:t>最难受的一回，不是挨打。</w:t>
+      </w:r>
+    </w:p>
+    <w:p>
+      <w:r>
+        <w:t>是他在北荒矿场，看见一群刚飞升上来的人族修士，被妖修管事按着头验骨龄。那些人在下界都是一方豪杰，飞升时也曾意气风发，以为跨过天门便是大道坦途。结果到了灵界，第一件事，是被人像挑牲口一样挑肩背、看牙口、测灵根，再按“耐用”两个字，分去矿坑、药圃、兽栏。</w:t>
+      </w:r>
+    </w:p>
+    <w:p>
+      <w:r>
+        <w:t>有个白发老修不肯跪，说自己在下界也是开宗立派的人物。</w:t>
+      </w:r>
+    </w:p>
+    <w:p>
+      <w:r>
+        <w:t>妖修管事笑了一声，抬脚踩断了他的膝盖。</w:t>
+      </w:r>
+    </w:p>
+    <w:p>
+      <w:r>
+        <w:t>周围人族修士全低下头。</w:t>
+      </w:r>
+    </w:p>
+    <w:p>
+      <w:r>
+        <w:t>王敦那天就在队伍末尾，脸上易了容，肩上挑着两袋劣矿。他听见骨头断开的声音，心里那股火，烧得比当年齐国皇监还狠。</w:t>
+      </w:r>
+    </w:p>
+    <w:p>
+      <w:r>
+        <w:t>可他没有动。</w:t>
+      </w:r>
+    </w:p>
+    <w:p>
+      <w:r>
+        <w:t>他不能动。</w:t>
+      </w:r>
+    </w:p>
+    <w:p>
+      <w:r>
+        <w:t>那矿场上空悬着妖王法目，四角各有炼虚妖修坐镇。他一动，不光救不了那白发老修，连同一批飞升者都要被当成叛乱杂役活剐。于是他咬着牙，把那两袋劣矿挑回洞里，夜里悄悄摸出去，给那老修送了一包止血的药粉。</w:t>
+      </w:r>
+    </w:p>
+    <w:p>
+      <w:r>
+        <w:t>老修疼得满头冷汗，抓着他的手，只问了一句：“小友，人族在灵界，一直都这样吗？”</w:t>
+      </w:r>
+    </w:p>
+    <w:p>
+      <w:r>
+        <w:t>王敦当时没答上来。</w:t>
+      </w:r>
+    </w:p>
+    <w:p>
+      <w:r>
+        <w:t>因为答案太难听。</w:t>
+      </w:r>
+    </w:p>
+    <w:p>
+      <w:r>
+        <w:t>一直都这样。</w:t>
+      </w:r>
+    </w:p>
+    <w:p>
+      <w:r>
+        <w:t>也不能一直这样。</w:t>
+      </w:r>
+    </w:p>
+    <w:p>
+      <w:r>
+        <w:t>那句话，他在心里压了一百年。</w:t>
+      </w:r>
+    </w:p>
+    <w:p>
+      <w:r>
         <w:t>有一回，他在一处坊市里，好不容易淘换到一炉上好的火灵砂，刚要付钱，半路杀出个神族纨绔，二话不说，一脚把摊子踹了，东西尽数抢走。那摊主是个人族老汉，敢怒不敢言，只能眼睁睁看着。王敦攥着拳头，那一身火与力在心口烧得他眼睛发红，到底，还是把火气一寸一寸地咽了回去。</w:t>
       </w:r>
     </w:p>
@@ -6667,6 +8377,56 @@
     <w:p>
       <w:r>
         <w:t>“嘘。”王敦背着手，悄悄冲他比了个噤声的手势，眼角飞快地、贱兮兮地挑了一下，那意思再明白不过：别说话，老子在这儿呢，天塌不下来。</w:t>
+      </w:r>
+    </w:p>
+    <w:p>
+      <w:r>
+        <w:t>这一下挤眉弄眼，几乎用掉了王敦全部的镇定。</w:t>
+      </w:r>
+    </w:p>
+    <w:p>
+      <w:r>
+        <w:t>离得这么近，他才看清贺平生背上的尘土和血。那只踩人的脚压在脊骨上，力道不急不缓，像是踩着一块无关紧要的石头。贺平生唇边还有血，手指却扣着地面，指节里全是土，显然方才已经试过挣扎，又被更重地压了回去。</w:t>
+      </w:r>
+    </w:p>
+    <w:p>
+      <w:r>
+        <w:t>王敦胸口那股火，险些当场炸开。</w:t>
+      </w:r>
+    </w:p>
+    <w:p>
+      <w:r>
+        <w:t>但他不能炸。</w:t>
+      </w:r>
+    </w:p>
+    <w:p>
+      <w:r>
+        <w:t>他若炸了，今日这里就只会多两具人族尸体。明月佛尊会拂一拂袈裟，继续做他的天佛帝域高徒；围观的妖修会笑一阵，转头忘掉；贺平生那点不肯低头的骨气，也会被踩进尘土里，成一句“不自量力”的闲谈。</w:t>
+      </w:r>
+    </w:p>
+    <w:p>
+      <w:r>
+        <w:t>不行。</w:t>
+      </w:r>
+    </w:p>
+    <w:p>
+      <w:r>
+        <w:t>这口气，不能让它这么便宜地散。</w:t>
+      </w:r>
+    </w:p>
+    <w:p>
+      <w:r>
+        <w:t>所以王敦笑。</w:t>
+      </w:r>
+    </w:p>
+    <w:p>
+      <w:r>
+        <w:t>笑得越贱，心里越冷。</w:t>
+      </w:r>
+    </w:p>
+    <w:p>
+      <w:r>
+        <w:t>这张脸皮，他在天牢里练过，在灵药谷练过，在一百年的灵界夹缝里练过。它不是为了讨好人，是为了在拳头打不过的时候，先把命拖住，把局拖乱，把那一点能咬人的机会拖出来。</w:t>
       </w:r>
     </w:p>
     <w:p>
@@ -7334,6 +9094,66 @@
     </w:p>
     <w:p>
       <w:r>
+        <w:t>王敦把瓷瓶贴身放好时，指腹在瓶身上多停了一息。</w:t>
+      </w:r>
+    </w:p>
+    <w:p>
+      <w:r>
+        <w:t>冰玉枇杷膏，听着像疗伤药，落到他手里，却比寻常法宝还沉。</w:t>
+      </w:r>
+    </w:p>
+    <w:p>
+      <w:r>
+        <w:t>因为这不是贺平生随手给的东西。</w:t>
+      </w:r>
+    </w:p>
+    <w:p>
+      <w:r>
+        <w:t>这小子从来不爱攒花哨玩意儿。身上的丹药、符箓、灵材，件件都有用途，件件都要在刀口上用。能被他拿出来塞给王敦，说明他早就替王敦想过：这个师兄总爱逞能，总爱冲最凶的地方去，总爱把自己弄得满身焦黑还嘴硬说没事。</w:t>
+      </w:r>
+    </w:p>
+    <w:p>
+      <w:r>
+        <w:t>所以要备药。</w:t>
+      </w:r>
+    </w:p>
+    <w:p>
+      <w:r>
+        <w:t>王敦忽然有点想骂人。</w:t>
+      </w:r>
+    </w:p>
+    <w:p>
+      <w:r>
+        <w:t>一个人若只是欠你，你还得清；一个人若开始替你预备后路，这账就真麻烦了。</w:t>
+      </w:r>
+    </w:p>
+    <w:p>
+      <w:r>
+        <w:t>他抬眼看贺平生，想说你少操心老子。可话到嘴边，又觉得这话太薄。最后只化成一声不轻不重的哼。</w:t>
+      </w:r>
+    </w:p>
+    <w:p>
+      <w:r>
+        <w:t>“行。”他说，“老子省着用。”</w:t>
+      </w:r>
+    </w:p>
+    <w:p>
+      <w:r>
+        <w:t>贺平生点头。</w:t>
+      </w:r>
+    </w:p>
+    <w:p>
+      <w:r>
+        <w:t>像是终于放心了一点。</w:t>
+      </w:r>
+    </w:p>
+    <w:p>
+      <w:r>
+        <w:t>就这一点放心，王敦觉得比那瓶药还叫人招架不住。</w:t>
+      </w:r>
+    </w:p>
+    <w:p>
+      <w:r>
         <w:t>“对了。”他忽然想起一桩要紧事，神色一正，“老弟，往后在这天火大陆，有一个地方，你打死也别去——大伦帝域。”</w:t>
       </w:r>
     </w:p>
@@ -7672,6 +9492,81 @@
     </w:p>
     <w:p>
       <w:r>
+        <w:t>他很清楚，空空妖修围着看的，不只是他这具身子能撑多久。</w:t>
+      </w:r>
+    </w:p>
+    <w:p>
+      <w:r>
+        <w:t>他们在等他怕。</w:t>
+      </w:r>
+    </w:p>
+    <w:p>
+      <w:r>
+        <w:t>等他从一开始的嘴硬，变成喘息，变成沉默，最后变成求饶。妖族最爱看这个。尤其爱看一个刚在天火大陆闯出名声的人族，被抽到骨头软、眼神散，再一点点承认自己不过如此。</w:t>
+      </w:r>
+    </w:p>
+    <w:p>
+      <w:r>
+        <w:t>王敦偏不让他们看。</w:t>
+      </w:r>
+    </w:p>
+    <w:p>
+      <w:r>
+        <w:t>疼，他受着。</w:t>
+      </w:r>
+    </w:p>
+    <w:p>
+      <w:r>
+        <w:t>血，他流着。</w:t>
+      </w:r>
+    </w:p>
+    <w:p>
+      <w:r>
+        <w:t>可笑也得他笑，骂也得他骂。哪怕只剩一口气，也要把这刑场搅得像茶馆说书，叫那帮等着看他崩溃的妖修，一个个憋得不上不下。</w:t>
+      </w:r>
+    </w:p>
+    <w:p>
+      <w:r>
+        <w:t>这是他现在唯一能用的刀。</w:t>
+      </w:r>
+    </w:p>
+    <w:p>
+      <w:r>
+        <w:t>真元被封，手脚被锁，炼虚真身只能硬扛，火也烧不出去。嘴还在。</w:t>
+      </w:r>
+    </w:p>
+    <w:p>
+      <w:r>
+        <w:t>嘴在，王敦就还没输干净。</w:t>
+      </w:r>
+    </w:p>
+    <w:p>
+      <w:r>
+        <w:t>他甚至故意把每一次喘息都压在笑声后头。鞭子落下前，他先说话；鞭子落下后，他接着说话。疼得眼前发黑时，他就盯着刑柱下那只蚂蚁，心里默数到三，再把下一句胡话顶出去。</w:t>
+      </w:r>
+    </w:p>
+    <w:p>
+      <w:r>
+        <w:t>能拖一刻是一刻。</w:t>
+      </w:r>
+    </w:p>
+    <w:p>
+      <w:r>
+        <w:t>拖到贺平生走远。</w:t>
+      </w:r>
+    </w:p>
+    <w:p>
+      <w:r>
+        <w:t>拖到这帮妖修先烦。</w:t>
+      </w:r>
+    </w:p>
+    <w:p>
+      <w:r>
+        <w:t>拖到那条不知道会不会来的活路，自己裂出一丝缝。</w:t>
+      </w:r>
+    </w:p>
+    <w:p>
+      <w:r>
         <w:t>越是这种时候，越不能软。你软一分，敌人就硬十分；你嘴上不饶人，他反倒摸不准你深浅，不敢真把你怎么样——这道理，他在死人堆里，早磨透了。骨头一旦跪下去，就再也站不起来了。</w:t>
       </w:r>
     </w:p>
@@ -8315,6 +10210,61 @@
     </w:p>
     <w:p>
       <w:r>
+        <w:t>而他自己，在那场荒唐皇帝梦里，也不是半点东西没看见。</w:t>
+      </w:r>
+    </w:p>
+    <w:p>
+      <w:r>
+        <w:t>梦里的龙椅很软，美人很香，红烧肉也真好吃。可越往后，他越觉得那座皇城空。满殿宫灯亮得晃眼，却没有一盏是等他的；满朝文武山呼万岁，却没有一个人敢抬头看他的脸；后宫里热闹得鸡飞狗跳，热闹底下，全是红雾捏出来的假声假笑。</w:t>
+      </w:r>
+    </w:p>
+    <w:p>
+      <w:r>
+        <w:t>那梦最毒的地方，不是美色。</w:t>
+      </w:r>
+    </w:p>
+    <w:p>
+      <w:r>
+        <w:t>是它给人一种“我终于什么都有了”的错觉。</w:t>
+      </w:r>
+    </w:p>
+    <w:p>
+      <w:r>
+        <w:t>王敦这辈子缺过太多东西，缺安稳，缺家，缺一个能把真名说出口的地方。梦里一股脑全给他补上，补得金碧辉煌，补得人人围着他转。若他真顺着那份贪心沉下去，未必比那些被慈悲困住、被权势困住的人醒得更快。</w:t>
+      </w:r>
+    </w:p>
+    <w:p>
+      <w:r>
+        <w:t>他能醒，是因为太假。</w:t>
+      </w:r>
+    </w:p>
+    <w:p>
+      <w:r>
+        <w:t>假到没有一声贺平生那样的“王师兄”。</w:t>
+      </w:r>
+    </w:p>
+    <w:p>
+      <w:r>
+        <w:t>假到没有人会在他闹得最过分时，皱着眉说一句“别胡来”。</w:t>
+      </w:r>
+    </w:p>
+    <w:p>
+      <w:r>
+        <w:t>他当时坐在龙椅上，忽然觉得没意思。</w:t>
+      </w:r>
+    </w:p>
+    <w:p>
+      <w:r>
+        <w:t>于是更胡来。</w:t>
+      </w:r>
+    </w:p>
+    <w:p>
+      <w:r>
+        <w:t>胡来到把梦搅碎，也把自己搅醒。</w:t>
+      </w:r>
+    </w:p>
+    <w:p>
+      <w:r>
         <w:t>王敦走过去，二话不说，一把抓起师弟的手，把那块温热的入梦之石，硬塞进了他掌心。</w:t>
       </w:r>
     </w:p>
@@ -8708,6 +10658,71 @@
     </w:p>
     <w:p>
       <w:r>
+        <w:t>她本该继续劝的。</w:t>
+      </w:r>
+    </w:p>
+    <w:p>
+      <w:r>
+        <w:t>从凤族立场看，让王敦退，是最稳妥的局面。贺平生被十三长老压在十万丈，入梦之石易主，天梯资格归位，凤族脸面保住。至于人族那口气被压回去，跟凤族又有什么关系？</w:t>
+      </w:r>
+    </w:p>
+    <w:p>
+      <w:r>
+        <w:t>可凤晚曦忽然想起三梦红尘里，王敦被她们追着满皇城跑时，明明狼狈得要命，眼底却始终没有真正的恶意。</w:t>
+      </w:r>
+    </w:p>
+    <w:p>
+      <w:r>
+        <w:t>这人荒唐，轻浮，欠揍。</w:t>
+      </w:r>
+    </w:p>
+    <w:p>
+      <w:r>
+        <w:t>却不脏。</w:t>
+      </w:r>
+    </w:p>
+    <w:p>
+      <w:r>
+        <w:t>梦里他搅乱红尘，梦外他把入梦之石塞给贺平生。一个嘴上占尽便宜的人，真到大事上，反而比许多道貌岸然的人干净。</w:t>
+      </w:r>
+    </w:p>
+    <w:p>
+      <w:r>
+        <w:t>凤晚曦不愿承认自己被这种人触动。</w:t>
+      </w:r>
+    </w:p>
+    <w:p>
+      <w:r>
+        <w:t>可她也不愿看他被十三长老当场烧成灰。</w:t>
+      </w:r>
+    </w:p>
+    <w:p>
+      <w:r>
+        <w:t>于是那点凤羽火落了下去。</w:t>
+      </w:r>
+    </w:p>
+    <w:p>
+      <w:r>
+        <w:t>很轻。</w:t>
+      </w:r>
+    </w:p>
+    <w:p>
+      <w:r>
+        <w:t>轻到几乎可以说是无意。</w:t>
+      </w:r>
+    </w:p>
+    <w:p>
+      <w:r>
+        <w:t>也重。</w:t>
+      </w:r>
+    </w:p>
+    <w:p>
+      <w:r>
+        <w:t>重到她自己都知道，从这一刻起，她和王敦之间，不再只是梦劫里那场荒唐旧账。</w:t>
+      </w:r>
+    </w:p>
+    <w:p>
+      <w:r>
         <w:t>她只是抬手，指尖一缕凤羽火光悄无声息地坠下，落到王敦脚边。那火光没有杀意，反倒像一枚短暂亮起的标记，把十三长老阵法里最薄的那一线空隙，映了出来。</w:t>
       </w:r>
     </w:p>
@@ -9146,6 +11161,61 @@
     </w:p>
     <w:p>
       <w:r>
+        <w:t>站着，说明还没认输。</w:t>
+      </w:r>
+    </w:p>
+    <w:p>
+      <w:r>
+        <w:t>王敦最懂这种站法。</w:t>
+      </w:r>
+    </w:p>
+    <w:p>
+      <w:r>
+        <w:t>不是赢得了，也不是不疼，更不是心里没有怕。是人被逼到某个份上，退一步，身后就没东西了，只能把脚钉在那儿。齐国天牢里，他这么站过；定襄城门的阴影里，他差点没能这么站；灵界明月佛尊脚下，贺平生替他把这口气站了出来。</w:t>
+      </w:r>
+    </w:p>
+    <w:p>
+      <w:r>
+        <w:t>今日换他来。</w:t>
+      </w:r>
+    </w:p>
+    <w:p>
+      <w:r>
+        <w:t>他抬头望着十万丈上的火网，忽然觉得那些凤火像极了世道。</w:t>
+      </w:r>
+    </w:p>
+    <w:p>
+      <w:r>
+        <w:t>高处的人说，这里不是给你踏的。</w:t>
+      </w:r>
+    </w:p>
+    <w:p>
+      <w:r>
+        <w:t>规矩说，这里不是给你争的。</w:t>
+      </w:r>
+    </w:p>
+    <w:p>
+      <w:r>
+        <w:t>血脉说，你天生就该低一头。</w:t>
+      </w:r>
+    </w:p>
+    <w:p>
+      <w:r>
+        <w:t>若是从前，王敦多半会笑嘻嘻绕开，等没人看见时再从旁边挖个洞钻过去。能活就是赢，面子算个屁。</w:t>
+      </w:r>
+    </w:p>
+    <w:p>
+      <w:r>
+        <w:t>可这些年，贺平生一次次在他旁边，把“不绕”这两个字烧得太亮。</w:t>
+      </w:r>
+    </w:p>
+    <w:p>
+      <w:r>
+        <w:t>亮到王敦也想看看，正面撞上去，会不会真把这堵墙撞出个窟窿。</w:t>
+      </w:r>
+    </w:p>
+    <w:p>
+      <w:r>
         <w:t>王敦心口那根绷了一路的弦，稍稍松了半寸。</w:t>
       </w:r>
     </w:p>
@@ -9557,6 +11627,56 @@
     <w:p>
       <w:r>
         <w:t>十二万丈。</w:t>
+      </w:r>
+    </w:p>
+    <w:p>
+      <w:r>
+        <w:t>第一万丈，王敦替贺平生吃了三道凤火，肩头皮肉被烧得卷起，焦味混着血腥味往鼻子里钻。他疼得想骂娘，可余光瞥见贺平生手里的纯火还稳，便把那口骂咽回去，换成一声笑。</w:t>
+      </w:r>
+    </w:p>
+    <w:p>
+      <w:r>
+        <w:t>第二万丈，贺平生替他烧开一段阵纹。那阵纹像活物，刚被纯火逼退，立刻又缠上王敦脚踝。王敦一脚踩碎，脚底血肉模糊，嘴上却喊：“老弟，火候不错，比当年烧烈阳花强。”</w:t>
+      </w:r>
+    </w:p>
+    <w:p>
+      <w:r>
+        <w:t>贺平生没理他。</w:t>
+      </w:r>
+    </w:p>
+    <w:p>
+      <w:r>
+        <w:t>不理，就是还撑得住。</w:t>
+      </w:r>
+    </w:p>
+    <w:p>
+      <w:r>
+        <w:t>第三万丈，凤族十三长老同时换阵，火网从外压变成内绞。王敦的法天象地虚影被绞得裂开几道缝，胸口一闷，险些吐血。他硬生生把那口血吞回去，抬肘撞开一条火线，给贺平生留出半步。</w:t>
+      </w:r>
+    </w:p>
+    <w:p>
+      <w:r>
+        <w:t>半步很窄。</w:t>
+      </w:r>
+    </w:p>
+    <w:p>
+      <w:r>
+        <w:t>窄得像当年齐国天牢里的排灵废沟。</w:t>
+      </w:r>
+    </w:p>
+    <w:p>
+      <w:r>
+        <w:t>可他这辈子最擅长的，就是从窄缝里爬出去。</w:t>
+      </w:r>
+    </w:p>
+    <w:p>
+      <w:r>
+        <w:t>不同的是，那一年他只顾自己爬。</w:t>
+      </w:r>
+    </w:p>
+    <w:p>
+      <w:r>
+        <w:t>今日这道缝，他要两个人一起过。</w:t>
       </w:r>
     </w:p>
     <w:p>
@@ -11784,6 +13904,66 @@
     </w:p>
     <w:p>
       <w:r>
+        <w:t>他越想，脑子越亮。</w:t>
+      </w:r>
+    </w:p>
+    <w:p>
+      <w:r>
+        <w:t>因果符最妙的地方，不是能碎。</w:t>
+      </w:r>
+    </w:p>
+    <w:p>
+      <w:r>
+        <w:t>是它碎得“同时”。</w:t>
+      </w:r>
+    </w:p>
+    <w:p>
+      <w:r>
+        <w:t>仙界隔着千山万水，音讯慢得像老牛拉车。可因符一裂，果符那边立刻有应。这不是一句话，却是一根穿过虚空的线。线只会抖一下，旁人嫌它粗笨，王敦却觉得够了。</w:t>
+      </w:r>
+    </w:p>
+    <w:p>
+      <w:r>
+        <w:t>线抖一下，是一。</w:t>
+      </w:r>
+    </w:p>
+    <w:p>
+      <w:r>
+        <w:t>不抖，是零。</w:t>
+      </w:r>
+    </w:p>
+    <w:p>
+      <w:r>
+        <w:t>若把“有”和“无”排成格，再给每个格子配一个字，传讯就不必靠一整句话，而是靠很多个小得不能再小的信号。</w:t>
+      </w:r>
+    </w:p>
+    <w:p>
+      <w:r>
+        <w:t>这念头一通，他整个人都兴奋起来。</w:t>
+      </w:r>
+    </w:p>
+    <w:p>
+      <w:r>
+        <w:t>天牢三年，他最会等半个呼吸的缝；逃亡几十年，他最会把碎消息拼成活路。如今不过是把一堆碎掉的符，拼成一句话。</w:t>
+      </w:r>
+    </w:p>
+    <w:p>
+      <w:r>
+        <w:t>这事别人嫌麻烦。</w:t>
+      </w:r>
+    </w:p>
+    <w:p>
+      <w:r>
+        <w:t>他不嫌。</w:t>
+      </w:r>
+    </w:p>
+    <w:p>
+      <w:r>
+        <w:t>王敦这辈子，就是靠麻烦活下来的。</w:t>
+      </w:r>
+    </w:p>
+    <w:p>
+      <w:r>
         <w:t>不再是别人说“王敦在哪，抓他”。</w:t>
       </w:r>
     </w:p>
@@ -13667,6 +15847,56 @@
     </w:p>
     <w:p>
       <w:r>
+        <w:t>更要命的是，他自己也不甘心只求撑腰。</w:t>
+      </w:r>
+    </w:p>
+    <w:p>
+      <w:r>
+        <w:t>撑腰这事太熟了。</w:t>
+      </w:r>
+    </w:p>
+    <w:p>
+      <w:r>
+        <w:t>弱的时候想找强的，孤身一人时想找靠山，刚从天牢爬出来时，他也想过：若背后有一个齐国不敢惹的人，是不是就不用跑得那么狼狈。</w:t>
+      </w:r>
+    </w:p>
+    <w:p>
+      <w:r>
+        <w:t>可一路跑到仙界，他见过太多靠山。</w:t>
+      </w:r>
+    </w:p>
+    <w:p>
+      <w:r>
+        <w:t>齐国皇室的靠山是国运和九龙宝镜，照样被他搅得脸面扫地；明月佛尊的靠山是天佛帝域，脚踩同族时也不过让人恶心；凤族十三长老背后有凤族女帝，仍被人族双璧踏上十五万丈。</w:t>
+      </w:r>
+    </w:p>
+    <w:p>
+      <w:r>
+        <w:t>靠山能挡风。</w:t>
+      </w:r>
+    </w:p>
+    <w:p>
+      <w:r>
+        <w:t>挡不了心里那口气。</w:t>
+      </w:r>
+    </w:p>
+    <w:p>
+      <w:r>
+        <w:t>王敦今日进紫薇星门，当然想活，当然想让追杀他的人掂量三分。可若只为这个，他拜不拜师都还是从前那个逃命鬼，只是从“没有靠山的逃命鬼”，变成“躲在混元神帝门下的逃命鬼”。</w:t>
+      </w:r>
+    </w:p>
+    <w:p>
+      <w:r>
+        <w:t>他不想这样。</w:t>
+      </w:r>
+    </w:p>
+    <w:p>
+      <w:r>
+        <w:t>他想有一天，别人提起王敦，不先看他背后站着谁，而先看他自己走到了哪一步。</w:t>
+      </w:r>
+    </w:p>
+    <w:p>
+      <w:r>
         <w:t>王敦斟酌半天。</w:t>
       </w:r>
     </w:p>
@@ -14173,6 +16403,81 @@
     <w:p>
       <w:r>
         <w:t>头顶一条紫薇星河，日日夜夜垂落星辉，照得人连偷懒都像在亵渎天道。</w:t>
+      </w:r>
+    </w:p>
+    <w:p>
+      <w:r>
+        <w:t>最麻烦的是安静。</w:t>
+      </w:r>
+    </w:p>
+    <w:p>
+      <w:r>
+        <w:t>王敦这一生，几乎没怎么安静过。天牢里有锁链响，逃亡路上有风声和追兵，灵药谷有火塘噼啪，九国大比有看台喧哗，灵界有妖修怒吼，仙界刚飞升又有半条街围着“王敦密码”吵。</w:t>
+      </w:r>
+    </w:p>
+    <w:p>
+      <w:r>
+        <w:t>突然被丢进这么一间密室，四面星石不说话，头顶星河不说话，连送资源的小仙童都放下东西就跑，王敦反倒有点不习惯。</w:t>
+      </w:r>
+    </w:p>
+    <w:p>
+      <w:r>
+        <w:t>太安静了，人就容易听见自己心里的动静。</w:t>
+      </w:r>
+    </w:p>
+    <w:p>
+      <w:r>
+        <w:t>他听见齐国天牢里那句“九龙逃了”。</w:t>
+      </w:r>
+    </w:p>
+    <w:p>
+      <w:r>
+        <w:t>听见定襄城门口铜锣敲响。</w:t>
+      </w:r>
+    </w:p>
+    <w:p>
+      <w:r>
+        <w:t>听见贺平生在天极绝地里说“今天，换我”。</w:t>
+      </w:r>
+    </w:p>
+    <w:p>
+      <w:r>
+        <w:t>听见十五万丈上，满场人族喊“人族双璧”。</w:t>
+      </w:r>
+    </w:p>
+    <w:p>
+      <w:r>
+        <w:t>这些声音一层一层叠在星辉里，逼得他没法再把凝道种当成普通修炼。</w:t>
+      </w:r>
+    </w:p>
+    <w:p>
+      <w:r>
+        <w:t>道种是什么？</w:t>
+      </w:r>
+    </w:p>
+    <w:p>
+      <w:r>
+        <w:t>不是修为数字，也不是又一张能拿出去吓人的招牌。</w:t>
+      </w:r>
+    </w:p>
+    <w:p>
+      <w:r>
+        <w:t>它像是在问他：王敦，你这辈子一路从逃命跑到仙界，跑到混元门下，究竟想把自己凝成个什么东西？</w:t>
+      </w:r>
+    </w:p>
+    <w:p>
+      <w:r>
+        <w:t>这个问题，比打架烦。</w:t>
+      </w:r>
+    </w:p>
+    <w:p>
+      <w:r>
+        <w:t>打架有敌人。</w:t>
+      </w:r>
+    </w:p>
+    <w:p>
+      <w:r>
+        <w:t>这个问题，敌人是自己。</w:t>
       </w:r>
     </w:p>
     <w:p>
@@ -15775,6 +18080,271 @@
     </w:p>
     <w:p>
       <w:r>
+        <w:t>那目光很奇怪。</w:t>
+      </w:r>
+    </w:p>
+    <w:p>
+      <w:r>
+        <w:t>王敦这些年被太多人看过。</w:t>
+      </w:r>
+    </w:p>
+    <w:p>
+      <w:r>
+        <w:t>齐国皇室看他，是看一件奇货，看一条能榨国运的活脉。</w:t>
+      </w:r>
+    </w:p>
+    <w:p>
+      <w:r>
+        <w:t>修真界散修看他，是看一张海捕文书上的悬赏。</w:t>
+      </w:r>
+    </w:p>
+    <w:p>
+      <w:r>
+        <w:t>凤族长老看他，是看不知天高地厚的人族小辈。</w:t>
+      </w:r>
+    </w:p>
+    <w:p>
+      <w:r>
+        <w:t>青莲道君那样的人看他，多半只看见一个能被因果威压碾碎的后辈。</w:t>
+      </w:r>
+    </w:p>
+    <w:p>
+      <w:r>
+        <w:t>重华不是。</w:t>
+      </w:r>
+    </w:p>
+    <w:p>
+      <w:r>
+        <w:t>她像是在看一个活人。</w:t>
+      </w:r>
+    </w:p>
+    <w:p>
+      <w:r>
+        <w:t>看他怎样笑，怎样藏，怎样在听到“心里有人”四个字时忽然忘了插科打诨，怎样把一身伤疤和旧账全压在那点贱兮兮的白牙笑底下。</w:t>
+      </w:r>
+    </w:p>
+    <w:p>
+      <w:r>
+        <w:t>这比威压难顶多了。</w:t>
+      </w:r>
+    </w:p>
+    <w:p>
+      <w:r>
+        <w:t>威压来了，他还能拿骨头扛。</w:t>
+      </w:r>
+    </w:p>
+    <w:p>
+      <w:r>
+        <w:t>这种目光来了，他连该往哪儿躲都不知道。</w:t>
+      </w:r>
+    </w:p>
+    <w:p>
+      <w:r>
+        <w:t>王敦下意识想说点混账话，把气氛搅浑。比如“公主殿下别这么看，容易看出感情债”；又比如“师妹眼神这么好，回头帮我看看青莲道君库房从哪边进”。话都到了舌尖，偏偏没吐出来。</w:t>
+      </w:r>
+    </w:p>
+    <w:p>
+      <w:r>
+        <w:t>因为重华先开口了。</w:t>
+      </w:r>
+    </w:p>
+    <w:p>
+      <w:r>
+        <w:t>“你很累吧。”</w:t>
+      </w:r>
+    </w:p>
+    <w:p>
+      <w:r>
+        <w:t>王敦愣住。</w:t>
+      </w:r>
+    </w:p>
+    <w:p>
+      <w:r>
+        <w:t>这句话，比方才所有关于道侣、侍妾、红颜知己的盘问都来得突然。</w:t>
+      </w:r>
+    </w:p>
+    <w:p>
+      <w:r>
+        <w:t>他甚至没听明白。</w:t>
+      </w:r>
+    </w:p>
+    <w:p>
+      <w:r>
+        <w:t>“什么？”</w:t>
+      </w:r>
+    </w:p>
+    <w:p>
+      <w:r>
+        <w:t>“这些年。”重华声音不高，“一直被人追，一直换脸，一直把自己说成不在乎，应该很累。”</w:t>
+      </w:r>
+    </w:p>
+    <w:p>
+      <w:r>
+        <w:t>屏风外，贺平生握着茶杯的手也顿了一下。</w:t>
+      </w:r>
+    </w:p>
+    <w:p>
+      <w:r>
+        <w:t>王敦嗓子里像被什么东西轻轻卡住。</w:t>
+      </w:r>
+    </w:p>
+    <w:p>
+      <w:r>
+        <w:t>累吗？</w:t>
+      </w:r>
+    </w:p>
+    <w:p>
+      <w:r>
+        <w:t>这种词，他从来不用在自己身上。疼就骂，怕就跑，输了就躲，赢了就笑。累这种软绵绵的字眼，像是给有人心疼的人准备的。</w:t>
+      </w:r>
+    </w:p>
+    <w:p>
+      <w:r>
+        <w:t>他没有。</w:t>
+      </w:r>
+    </w:p>
+    <w:p>
+      <w:r>
+        <w:t>所以他从不说。</w:t>
+      </w:r>
+    </w:p>
+    <w:p>
+      <w:r>
+        <w:t>王敦扯了扯嘴角，终于还是把那副熟悉的混不吝挂了回去。</w:t>
+      </w:r>
+    </w:p>
+    <w:p>
+      <w:r>
+        <w:t>“师妹这话说的。”他拍了拍胸口，“老子壮得很，天梯十五万丈都踩上去了，这点小事算什么累。”</w:t>
+      </w:r>
+    </w:p>
+    <w:p>
+      <w:r>
+        <w:t>重华没有戳穿他。</w:t>
+      </w:r>
+    </w:p>
+    <w:p>
+      <w:r>
+        <w:t>她只是点点头。</w:t>
+      </w:r>
+    </w:p>
+    <w:p>
+      <w:r>
+        <w:t>“那以后你累了，可以说。”</w:t>
+      </w:r>
+    </w:p>
+    <w:p>
+      <w:r>
+        <w:t>王敦这回真接不上话了。</w:t>
+      </w:r>
+    </w:p>
+    <w:p>
+      <w:r>
+        <w:t>这句话太轻，也太重。</w:t>
+      </w:r>
+    </w:p>
+    <w:p>
+      <w:r>
+        <w:t>轻得像随手递过来一杯茶。</w:t>
+      </w:r>
+    </w:p>
+    <w:p>
+      <w:r>
+        <w:t>重得像把他这些年藏在宽袍、假脸、胡话和白牙笑底下的疲惫，全都稳稳接住了。</w:t>
+      </w:r>
+    </w:p>
+    <w:p>
+      <w:r>
+        <w:t>王敦不是没人夸过。</w:t>
+      </w:r>
+    </w:p>
+    <w:p>
+      <w:r>
+        <w:t>九国大比后，有人夸他拳重；灵界天梯上，有人喊他人族双璧；仙界石碑前，有人喊他王敦祖师；紫薇神帝收他入门时，也说过天赋、悟性、气运。</w:t>
+      </w:r>
+    </w:p>
+    <w:p>
+      <w:r>
+        <w:t>那些话都亮堂。</w:t>
+      </w:r>
+    </w:p>
+    <w:p>
+      <w:r>
+        <w:t>亮堂得能照在外头。</w:t>
+      </w:r>
+    </w:p>
+    <w:p>
+      <w:r>
+        <w:t>可“累了可以说”这种话，不亮。</w:t>
+      </w:r>
+    </w:p>
+    <w:p>
+      <w:r>
+        <w:t>它像夜里一盏小灯，照的不是名声，不是战绩，不是他能不能再往上爬，而是他这个人撑久了，会不会也想坐一会儿。</w:t>
+      </w:r>
+    </w:p>
+    <w:p>
+      <w:r>
+        <w:t>王敦忽然有点明白，为什么贺平生刚才会说“他只是习惯先把自己藏起来”。</w:t>
+      </w:r>
+    </w:p>
+    <w:p>
+      <w:r>
+        <w:t>因为真有人愿意看见他藏起来的那部分时，他第一反应竟不是高兴。</w:t>
+      </w:r>
+    </w:p>
+    <w:p>
+      <w:r>
+        <w:t>是慌。</w:t>
+      </w:r>
+    </w:p>
+    <w:p>
+      <w:r>
+        <w:t>比被青莲道君威压扫中还慌。</w:t>
+      </w:r>
+    </w:p>
+    <w:p>
+      <w:r>
+        <w:t>贺平生低头喝茶，唇角极轻地动了一下。</w:t>
+      </w:r>
+    </w:p>
+    <w:p>
+      <w:r>
+        <w:t>像笑。</w:t>
+      </w:r>
+    </w:p>
+    <w:p>
+      <w:r>
+        <w:t>王敦立刻瞪过去。</w:t>
+      </w:r>
+    </w:p>
+    <w:p>
+      <w:r>
+        <w:t>老弟，你笑什么？</w:t>
+      </w:r>
+    </w:p>
+    <w:p>
+      <w:r>
+        <w:t>贺平生神色平静，仿佛什么都没发生。</w:t>
+      </w:r>
+    </w:p>
+    <w:p>
+      <w:r>
+        <w:t>可王敦知道，这小子记账了。</w:t>
+      </w:r>
+    </w:p>
+    <w:p>
+      <w:r>
+        <w:t>娘的。</w:t>
+      </w:r>
+    </w:p>
+    <w:p>
+      <w:r>
+        <w:t>今日这场自证清白，怎么越证越像给自己挖坑。</w:t>
+      </w:r>
+    </w:p>
+    <w:p>
+      <w:r>
         <w:t>“我只是想听听，别人眼里的你，和你自己藏起来的你，有多不一样。”</w:t>
       </w:r>
     </w:p>
@@ -16981,6 +19551,131 @@
     <w:p>
       <w:r>
         <w:t>“混元有禁令，你父亲不能乱插手。”</w:t>
+      </w:r>
+    </w:p>
+    <w:p>
+      <w:r>
+        <w:t>他说得很快，像是早把这条路堵死。</w:t>
+      </w:r>
+    </w:p>
+    <w:p>
+      <w:r>
+        <w:t>重华却没有立刻收回目光。</w:t>
+      </w:r>
+    </w:p>
+    <w:p>
+      <w:r>
+        <w:t>“你不必因为顾忌我父亲，什么都自己扛。”</w:t>
+      </w:r>
+    </w:p>
+    <w:p>
+      <w:r>
+        <w:t>王敦捏着阴阳符的手指紧了紧。</w:t>
+      </w:r>
+    </w:p>
+    <w:p>
+      <w:r>
+        <w:t>车外星河倒退，车内一时只剩九龙拉车的低吟。那枚符里的冷白镜光，像一根旧刺，从齐国天牢一路扎到仙界，扎得他掌心发麻。</w:t>
+      </w:r>
+    </w:p>
+    <w:p>
+      <w:r>
+        <w:t>“不是顾忌。”王敦低声道，“是这账不能这么算。”</w:t>
+      </w:r>
+    </w:p>
+    <w:p>
+      <w:r>
+        <w:t>重华看着他。</w:t>
+      </w:r>
+    </w:p>
+    <w:p>
+      <w:r>
+        <w:t>王敦把阴阳符摊在掌心，符面上“九龙宝镜碎片”几个残字还在一闪一灭。</w:t>
+      </w:r>
+    </w:p>
+    <w:p>
+      <w:r>
+        <w:t>“齐国锁过我，追过我，拿我当一件东西。他们欠的是我的命，我若转头请混元替我把他们碾平，当然痛快。”</w:t>
+      </w:r>
+    </w:p>
+    <w:p>
+      <w:r>
+        <w:t>他笑了笑。</w:t>
+      </w:r>
+    </w:p>
+    <w:p>
+      <w:r>
+        <w:t>“可痛快完呢？”</w:t>
+      </w:r>
+    </w:p>
+    <w:p>
+      <w:r>
+        <w:t>“别人会说，王敦运气真好。从前靠九龙气运，后来靠紫薇神帝的女儿，再后来靠混元岳父。一路都有人替他兜底。”</w:t>
+      </w:r>
+    </w:p>
+    <w:p>
+      <w:r>
+        <w:t>他抬眼，黑亮的眸子里，那点嬉皮笑脸褪得很干净。</w:t>
+      </w:r>
+    </w:p>
+    <w:p>
+      <w:r>
+        <w:t>“我不想这样。”</w:t>
+      </w:r>
+    </w:p>
+    <w:p>
+      <w:r>
+        <w:t>“我这一路靠别人救过命，欠过贺平生，欠过许多人。欠了我认，也会还。可齐国这笔账，我得亲手算。不是为了显得硬气，是为了告诉当年那个趴在排灵废沟里往外爬的王敦——”</w:t>
+      </w:r>
+    </w:p>
+    <w:p>
+      <w:r>
+        <w:t>他顿了顿。</w:t>
+      </w:r>
+    </w:p>
+    <w:p>
+      <w:r>
+        <w:t>“你没白爬。”</w:t>
+      </w:r>
+    </w:p>
+    <w:p>
+      <w:r>
+        <w:t>重华安静听着。</w:t>
+      </w:r>
+    </w:p>
+    <w:p>
+      <w:r>
+        <w:t>这一刻，她没再叫父亲，也没再提混元。</w:t>
+      </w:r>
+    </w:p>
+    <w:p>
+      <w:r>
+        <w:t>她只是伸手，把那枚阴阳符从他掌心轻轻按下去，像是帮他把那根旧刺先压住。</w:t>
+      </w:r>
+    </w:p>
+    <w:p>
+      <w:r>
+        <w:t>“那我不替你算。”</w:t>
+      </w:r>
+    </w:p>
+    <w:p>
+      <w:r>
+        <w:t>王敦看她。</w:t>
+      </w:r>
+    </w:p>
+    <w:p>
+      <w:r>
+        <w:t>重华道：“我陪你去看你怎么算。”</w:t>
+      </w:r>
+    </w:p>
+    <w:p>
+      <w:r>
+        <w:t>这话很轻。</w:t>
+      </w:r>
+    </w:p>
+    <w:p>
+      <w:r>
+        <w:t>却比“我让父亲出手”更重。</w:t>
       </w:r>
     </w:p>
     <w:p>

</xml_diff>